<commit_message>
fixed document generation format
</commit_message>
<xml_diff>
--- a/backend/templates/documents/individual-task.docx
+++ b/backend/templates/documents/individual-task.docx
@@ -1,13 +1,13 @@
 
 <file path=word/document.xml><?xml version="1.0" encoding="utf-8"?>
-<w:document xmlns:mc="http://schemas.openxmlformats.org/markup-compatibility/2006" xmlns:o="urn:schemas-microsoft-com:office:office" xmlns:r="http://schemas.openxmlformats.org/officeDocument/2006/relationships" xmlns:m="http://schemas.openxmlformats.org/officeDocument/2006/math" xmlns:v="urn:schemas-microsoft-com:vml" xmlns:wp="http://schemas.openxmlformats.org/drawingml/2006/wordprocessingDrawing" xmlns:w10="urn:schemas-microsoft-com:office:word" xmlns:w="http://schemas.openxmlformats.org/wordprocessingml/2006/main" xmlns:wne="http://schemas.microsoft.com/office/word/2006/wordml" xmlns:sl="http://schemas.openxmlformats.org/schemaLibrary/2006/main" xmlns:a="http://schemas.openxmlformats.org/drawingml/2006/main" xmlns:pic="http://schemas.openxmlformats.org/drawingml/2006/picture" xmlns:c="http://schemas.openxmlformats.org/drawingml/2006/chart" xmlns:lc="http://schemas.openxmlformats.org/drawingml/2006/lockedCanvas" xmlns:dgm="http://schemas.openxmlformats.org/drawingml/2006/diagram" xmlns:wps="http://schemas.microsoft.com/office/word/2010/wordprocessingShape" xmlns:wpg="http://schemas.microsoft.com/office/word/2010/wordprocessingGroup" xmlns:w14="http://schemas.microsoft.com/office/word/2010/wordml" xmlns:w15="http://schemas.microsoft.com/office/word/2012/wordml" xmlns:w16="http://schemas.microsoft.com/office/word/2018/wordml" xmlns:w16cex="http://schemas.microsoft.com/office/word/2018/wordml/cex" xmlns:w16cid="http://schemas.microsoft.com/office/word/2016/wordml/cid" xmlns="http://schemas.microsoft.com/office/tasks/2019/documenttasks" xmlns:cr="http://schemas.microsoft.com/office/comments/2020/reactions">
+<w:document xmlns:wpc="http://schemas.microsoft.com/office/word/2010/wordprocessingCanvas" xmlns:mc="http://schemas.openxmlformats.org/markup-compatibility/2006" xmlns:o="urn:schemas-microsoft-com:office:office" xmlns:r="http://schemas.openxmlformats.org/officeDocument/2006/relationships" xmlns:m="http://schemas.openxmlformats.org/officeDocument/2006/math" xmlns:v="urn:schemas-microsoft-com:vml" xmlns:wp14="http://schemas.microsoft.com/office/word/2010/wordprocessingDrawing" xmlns:wp="http://schemas.openxmlformats.org/drawingml/2006/wordprocessingDrawing" xmlns:w="http://schemas.openxmlformats.org/wordprocessingml/2006/main" xmlns:w14="http://schemas.microsoft.com/office/word/2010/wordml" xmlns:w10="urn:schemas-microsoft-com:office:word" xmlns:w15="http://schemas.microsoft.com/office/word/2012/wordml" xmlns:wpg="http://schemas.microsoft.com/office/word/2010/wordprocessingGroup" xmlns:wpi="http://schemas.microsoft.com/office/word/2010/wordprocessingInk" xmlns:wne="http://schemas.microsoft.com/office/word/2006/wordml" xmlns:wps="http://schemas.microsoft.com/office/word/2010/wordprocessingShape" xmlns:wpsCustomData="http://www.wps.cn/officeDocument/2013/wpsCustomData" mc:Ignorable="w14 w15 wp14">
   <w:body>
     <w:p>
       <w:pPr>
         <w:jc w:val="center"/>
         <w:rPr>
-          <w:b w:val="1"/>
-          <w:bCs w:val="1"/>
+          <w:b/>
+          <w:bCs/>
           <w:sz w:val="18"/>
           <w:szCs w:val="18"/>
           <w:u w:val="none"/>
@@ -15,22 +15,21 @@
       </w:pPr>
       <w:r>
         <w:rPr>
-          <w:b w:val="1"/>
-          <w:bCs w:val="1"/>
+          <w:b/>
+          <w:bCs/>
           <w:sz w:val="18"/>
           <w:szCs w:val="18"/>
           <w:u w:val="none"/>
-          <w:rtl w:val="0"/>
-        </w:rPr>
-        <w:t xml:space="preserve">Министерство науки и высшего образования Российской Федерации</w:t>
+        </w:rPr>
+        <w:t>Министерство науки и высшего образования Российской Федерации</w:t>
       </w:r>
     </w:p>
     <w:p>
       <w:pPr>
         <w:jc w:val="center"/>
         <w:rPr>
-          <w:b w:val="1"/>
-          <w:bCs w:val="1"/>
+          <w:b/>
+          <w:bCs/>
           <w:sz w:val="18"/>
           <w:szCs w:val="18"/>
           <w:u w:val="none"/>
@@ -38,14 +37,13 @@
       </w:pPr>
       <w:r>
         <w:rPr>
-          <w:b w:val="1"/>
-          <w:bCs w:val="1"/>
+          <w:b/>
+          <w:bCs/>
           <w:sz w:val="18"/>
           <w:szCs w:val="18"/>
           <w:u w:val="none"/>
-          <w:rtl w:val="0"/>
-        </w:rPr>
-        <w:t xml:space="preserve">ФГАОУ ВО «УрФУ имени первого Президента России Б.Н. Ельцина»</w:t>
+        </w:rPr>
+        <w:t>ФГАОУ ВО «УрФУ имени первого Президента России Б.Н. Ельцина»</w:t>
       </w:r>
     </w:p>
     <w:p>
@@ -56,46 +54,56 @@
           <w:u w:val="none"/>
         </w:rPr>
       </w:pPr>
-      <w:r>
-        <w:rPr>
-          <w:rtl w:val="0"/>
-        </w:rPr>
-      </w:r>
     </w:p>
     <w:tbl>
       <w:tblPr>
-        <w:tblStyle w:val="Table1"/>
-        <w:tblW w:w="9355.0" w:type="dxa"/>
-        <w:jc w:val="left"/>
+        <w:tblStyle w:val="13"/>
+        <w:tblW w:w="9355" w:type="dxa"/>
+        <w:tblInd w:w="0" w:type="dxa"/>
         <w:tblBorders>
-          <w:top w:color="000000" w:space="0" w:sz="0" w:val="nil"/>
-          <w:left w:color="000000" w:space="0" w:sz="0" w:val="nil"/>
-          <w:bottom w:color="000000" w:space="0" w:sz="0" w:val="nil"/>
-          <w:right w:color="000000" w:space="0" w:sz="0" w:val="nil"/>
-          <w:insideH w:color="000000" w:space="0" w:sz="0" w:val="nil"/>
-          <w:insideV w:color="000000" w:space="0" w:sz="0" w:val="nil"/>
+          <w:top w:val="none" w:color="auto" w:sz="0" w:space="0"/>
+          <w:left w:val="none" w:color="auto" w:sz="0" w:space="0"/>
+          <w:bottom w:val="none" w:color="auto" w:sz="0" w:space="0"/>
+          <w:right w:val="none" w:color="auto" w:sz="0" w:space="0"/>
+          <w:insideH w:val="none" w:color="auto" w:sz="0" w:space="0"/>
+          <w:insideV w:val="none" w:color="auto" w:sz="0" w:space="0"/>
         </w:tblBorders>
         <w:tblLayout w:type="fixed"/>
-        <w:tblLook w:val="0400"/>
+        <w:tblCellMar>
+          <w:top w:w="0" w:type="dxa"/>
+          <w:left w:w="108" w:type="dxa"/>
+          <w:bottom w:w="0" w:type="dxa"/>
+          <w:right w:w="108" w:type="dxa"/>
+        </w:tblCellMar>
       </w:tblPr>
       <w:tblGrid>
         <w:gridCol w:w="4677"/>
         <w:gridCol w:w="4678"/>
-        <w:tblGridChange w:id="0">
-          <w:tblGrid>
-            <w:gridCol w:w="4677"/>
-            <w:gridCol w:w="4678"/>
-          </w:tblGrid>
-        </w:tblGridChange>
       </w:tblGrid>
       <w:tr>
+        <w:tblPrEx>
+          <w:tblBorders>
+            <w:top w:val="none" w:color="auto" w:sz="0" w:space="0"/>
+            <w:left w:val="none" w:color="auto" w:sz="0" w:space="0"/>
+            <w:bottom w:val="none" w:color="auto" w:sz="0" w:space="0"/>
+            <w:right w:val="none" w:color="auto" w:sz="0" w:space="0"/>
+            <w:insideH w:val="none" w:color="auto" w:sz="0" w:space="0"/>
+            <w:insideV w:val="none" w:color="auto" w:sz="0" w:space="0"/>
+          </w:tblBorders>
+          <w:tblCellMar>
+            <w:top w:w="0" w:type="dxa"/>
+            <w:left w:w="108" w:type="dxa"/>
+            <w:bottom w:w="0" w:type="dxa"/>
+            <w:right w:w="108" w:type="dxa"/>
+          </w:tblCellMar>
+        </w:tblPrEx>
         <w:trPr>
-          <w:cantSplit w:val="0"/>
           <w:trHeight w:val="920" w:hRule="atLeast"/>
-          <w:tblHeader w:val="0"/>
         </w:trPr>
         <w:tc>
-          <w:tcPr/>
+          <w:tcPr>
+            <w:tcW w:w="4677" w:type="dxa"/>
+          </w:tcPr>
           <w:p>
             <w:pPr>
               <w:rPr>
@@ -109,9 +117,8 @@
                 <w:sz w:val="28"/>
                 <w:szCs w:val="28"/>
                 <w:u w:val="none"/>
-                <w:rtl w:val="0"/>
-              </w:rPr>
-              <w:t xml:space="preserve">СОГЛАСОВАНО               предприятие</w:t>
+              </w:rPr>
+              <w:t>СОГЛАСОВАНО               предприятие</w:t>
             </w:r>
           </w:p>
           <w:p>
@@ -121,31 +128,28 @@
                 <w:szCs w:val="28"/>
               </w:rPr>
             </w:pPr>
-            <w:bookmarkStart w:colFirst="0" w:colLast="0" w:name="_heading=h.3i9sxx77jg4" w:id="0"/>
+            <w:bookmarkStart w:id="0" w:name="_heading=h.3i9sxx77jg4" w:colFirst="0" w:colLast="0"/>
             <w:bookmarkEnd w:id="0"/>
             <w:r>
               <w:rPr>
                 <w:sz w:val="28"/>
                 <w:szCs w:val="28"/>
                 <w:u w:val="none"/>
-                <w:rtl w:val="0"/>
-              </w:rPr>
-              <w:t xml:space="preserve">«</w:t>
+              </w:rPr>
+              <w:t>«</w:t>
             </w:r>
             <w:r>
               <w:rPr>
                 <w:sz w:val="28"/>
                 <w:szCs w:val="28"/>
-                <w:rtl w:val="0"/>
-              </w:rPr>
-              <w:t xml:space="preserve">29</w:t>
+              </w:rPr>
+              <w:t>29</w:t>
             </w:r>
             <w:r>
               <w:rPr>
                 <w:sz w:val="28"/>
                 <w:szCs w:val="28"/>
                 <w:u w:val="none"/>
-                <w:rtl w:val="0"/>
               </w:rPr>
               <w:t xml:space="preserve">» </w:t>
             </w:r>
@@ -153,16 +157,14 @@
               <w:rPr>
                 <w:sz w:val="28"/>
                 <w:szCs w:val="28"/>
-                <w:rtl w:val="0"/>
-              </w:rPr>
-              <w:t xml:space="preserve">июня</w:t>
+              </w:rPr>
+              <w:t>июня</w:t>
             </w:r>
             <w:r>
               <w:rPr>
                 <w:sz w:val="28"/>
                 <w:szCs w:val="28"/>
                 <w:u w:val="none"/>
-                <w:rtl w:val="0"/>
               </w:rPr>
               <w:t xml:space="preserve"> 20</w:t>
             </w:r>
@@ -170,14 +172,15 @@
               <w:rPr>
                 <w:sz w:val="28"/>
                 <w:szCs w:val="28"/>
-                <w:rtl w:val="0"/>
-              </w:rPr>
-              <w:t xml:space="preserve">26</w:t>
+              </w:rPr>
+              <w:t>26</w:t>
             </w:r>
           </w:p>
         </w:tc>
         <w:tc>
-          <w:tcPr/>
+          <w:tcPr>
+            <w:tcW w:w="4678" w:type="dxa"/>
+          </w:tcPr>
           <w:p>
             <w:pPr>
               <w:rPr>
@@ -191,9 +194,8 @@
                 <w:sz w:val="28"/>
                 <w:szCs w:val="28"/>
                 <w:u w:val="none"/>
-                <w:rtl w:val="0"/>
-              </w:rPr>
-              <w:t xml:space="preserve">СОГЛАСОВАНО</w:t>
+              </w:rPr>
+              <w:t>СОГЛАСОВАНО</w:t>
             </w:r>
           </w:p>
           <w:p>
@@ -209,7 +211,6 @@
                 <w:sz w:val="28"/>
                 <w:szCs w:val="28"/>
                 <w:u w:val="none"/>
-                <w:rtl w:val="0"/>
               </w:rPr>
               <w:t xml:space="preserve"> УрФУ</w:t>
             </w:r>
@@ -226,32 +227,28 @@
                 <w:sz w:val="28"/>
                 <w:szCs w:val="28"/>
                 <w:u w:val="none"/>
-                <w:rtl w:val="0"/>
-              </w:rPr>
-              <w:t xml:space="preserve">«</w:t>
+              </w:rPr>
+              <w:t>«</w:t>
             </w:r>
             <w:r>
               <w:rPr>
                 <w:sz w:val="28"/>
                 <w:szCs w:val="28"/>
-                <w:rtl w:val="0"/>
-              </w:rPr>
-              <w:t xml:space="preserve">29</w:t>
+              </w:rPr>
+              <w:t>29</w:t>
             </w:r>
             <w:r>
               <w:rPr>
                 <w:sz w:val="28"/>
                 <w:szCs w:val="28"/>
                 <w:u w:val="none"/>
-                <w:rtl w:val="0"/>
-              </w:rPr>
-              <w:t xml:space="preserve">»</w:t>
+              </w:rPr>
+              <w:t>»</w:t>
             </w:r>
             <w:r>
               <w:rPr>
                 <w:sz w:val="28"/>
                 <w:szCs w:val="28"/>
-                <w:rtl w:val="0"/>
               </w:rPr>
               <w:t xml:space="preserve"> июня</w:t>
             </w:r>
@@ -260,7 +257,6 @@
                 <w:sz w:val="28"/>
                 <w:szCs w:val="28"/>
                 <w:u w:val="none"/>
-                <w:rtl w:val="0"/>
               </w:rPr>
               <w:t xml:space="preserve"> 20</w:t>
             </w:r>
@@ -268,28 +264,33 @@
               <w:rPr>
                 <w:sz w:val="28"/>
                 <w:szCs w:val="28"/>
-                <w:rtl w:val="0"/>
-              </w:rPr>
-              <w:t xml:space="preserve">26</w:t>
+              </w:rPr>
+              <w:t>26</w:t>
             </w:r>
           </w:p>
         </w:tc>
       </w:tr>
       <w:tr>
-        <w:trPr>
-          <w:cantSplit w:val="0"/>
-          <w:tblHeader w:val="0"/>
-        </w:trPr>
+        <w:tblPrEx>
+          <w:tblCellMar>
+            <w:top w:w="0" w:type="dxa"/>
+            <w:left w:w="108" w:type="dxa"/>
+            <w:bottom w:w="0" w:type="dxa"/>
+            <w:right w:w="108" w:type="dxa"/>
+          </w:tblCellMar>
+        </w:tblPrEx>
         <w:tc>
-          <w:tcPr/>
+          <w:tcPr>
+            <w:tcW w:w="4677" w:type="dxa"/>
+          </w:tcPr>
           <w:p>
             <w:pPr>
               <w:pBdr>
-                <w:top w:space="0" w:sz="0" w:val="nil"/>
-                <w:left w:space="0" w:sz="0" w:val="nil"/>
-                <w:bottom w:space="0" w:sz="0" w:val="nil"/>
-                <w:right w:space="0" w:sz="0" w:val="nil"/>
-                <w:between w:space="0" w:sz="0" w:val="nil"/>
+                <w:top w:val="none" w:color="auto" w:sz="0" w:space="0"/>
+                <w:left w:val="none" w:color="auto" w:sz="0" w:space="0"/>
+                <w:bottom w:val="none" w:color="auto" w:sz="0" w:space="0"/>
+                <w:right w:val="none" w:color="auto" w:sz="0" w:space="0"/>
+                <w:between w:val="none" w:color="auto" w:sz="0" w:space="0"/>
               </w:pBdr>
               <w:rPr>
                 <w:color w:val="000000"/>
@@ -302,7 +303,6 @@
                 <w:sz w:val="20"/>
                 <w:szCs w:val="20"/>
                 <w:u w:val="none"/>
-                <w:rtl w:val="0"/>
               </w:rPr>
               <w:t xml:space="preserve">Ответственный за практику на предприятии </w:t>
             </w:r>
@@ -310,31 +310,24 @@
               <w:rPr>
                 <w:color w:val="000000"/>
                 <w:u w:val="none"/>
-                <w:rtl w:val="0"/>
               </w:rPr>
               <w:t xml:space="preserve">__________                     </w:t>
             </w:r>
             <w:r>
               <w:rPr>
                 <w:color w:val="000000"/>
-                <w:rtl w:val="0"/>
-              </w:rPr>
-              <w:t xml:space="preserve">А.С. Езуб</w:t>
-            </w:r>
-            <w:r>
-              <w:rPr>
-                <w:rtl w:val="0"/>
-              </w:rPr>
+              </w:rPr>
+              <w:t>А.С. Езуб</w:t>
             </w:r>
           </w:p>
           <w:p>
             <w:pPr>
               <w:pBdr>
-                <w:top w:space="0" w:sz="0" w:val="nil"/>
-                <w:left w:space="0" w:sz="0" w:val="nil"/>
-                <w:bottom w:space="0" w:sz="0" w:val="nil"/>
-                <w:right w:space="0" w:sz="0" w:val="nil"/>
-                <w:between w:space="0" w:sz="0" w:val="nil"/>
+                <w:top w:val="none" w:color="auto" w:sz="0" w:space="0"/>
+                <w:left w:val="none" w:color="auto" w:sz="0" w:space="0"/>
+                <w:bottom w:val="none" w:color="auto" w:sz="0" w:space="0"/>
+                <w:right w:val="none" w:color="auto" w:sz="0" w:space="0"/>
+                <w:between w:val="none" w:color="auto" w:sz="0" w:space="0"/>
               </w:pBdr>
               <w:rPr>
                 <w:color w:val="000000"/>
@@ -349,7 +342,6 @@
                 <w:szCs w:val="16"/>
                 <w:u w:val="none"/>
                 <w:vertAlign w:val="superscript"/>
-                <w:rtl w:val="0"/>
               </w:rPr>
               <w:t xml:space="preserve">            </w:t>
             </w:r>
@@ -358,9 +350,8 @@
                 <w:color w:val="000000"/>
                 <w:u w:val="none"/>
                 <w:vertAlign w:val="superscript"/>
-                <w:rtl w:val="0"/>
-              </w:rPr>
-              <w:t xml:space="preserve">Подпись                                          расшифровка подписи</w:t>
+              </w:rPr>
+              <w:t>Подпись                                          расшифровка подписи</w:t>
             </w:r>
           </w:p>
           <w:p>
@@ -371,20 +362,17 @@
                 <w:u w:val="none"/>
               </w:rPr>
             </w:pPr>
-            <w:r>
-              <w:rPr>
-                <w:rtl w:val="0"/>
-              </w:rPr>
-            </w:r>
           </w:p>
         </w:tc>
         <w:tc>
-          <w:tcPr/>
-          <w:p>
-            <w:pPr>
-              <w:rPr>
-                <w:b w:val="1"/>
-                <w:bCs w:val="1"/>
+          <w:tcPr>
+            <w:tcW w:w="4678" w:type="dxa"/>
+          </w:tcPr>
+          <w:p>
+            <w:pPr>
+              <w:rPr>
+                <w:b/>
+                <w:bCs/>
                 <w:sz w:val="20"/>
                 <w:szCs w:val="20"/>
                 <w:u w:val="none"/>
@@ -395,24 +383,18 @@
                 <w:sz w:val="20"/>
                 <w:szCs w:val="20"/>
                 <w:u w:val="none"/>
-                <w:rtl w:val="0"/>
-              </w:rPr>
-              <w:t xml:space="preserve">Зав. кафедрой/Ответственный за практику/РОП</w:t>
-            </w:r>
-            <w:r>
-              <w:rPr>
-                <w:rtl w:val="0"/>
-              </w:rPr>
+              </w:rPr>
+              <w:t>Зав. кафедрой/Ответственный за практику/РОП</w:t>
             </w:r>
           </w:p>
           <w:p>
             <w:pPr>
               <w:pBdr>
-                <w:top w:space="0" w:sz="0" w:val="nil"/>
-                <w:left w:space="0" w:sz="0" w:val="nil"/>
-                <w:bottom w:space="0" w:sz="0" w:val="nil"/>
-                <w:right w:space="0" w:sz="0" w:val="nil"/>
-                <w:between w:space="0" w:sz="0" w:val="nil"/>
+                <w:top w:val="none" w:color="auto" w:sz="0" w:space="0"/>
+                <w:left w:val="none" w:color="auto" w:sz="0" w:space="0"/>
+                <w:bottom w:val="none" w:color="auto" w:sz="0" w:space="0"/>
+                <w:right w:val="none" w:color="auto" w:sz="0" w:space="0"/>
+                <w:between w:val="none" w:color="auto" w:sz="0" w:space="0"/>
               </w:pBdr>
               <w:rPr>
                 <w:color w:val="000000"/>
@@ -423,14 +405,12 @@
               <w:rPr>
                 <w:color w:val="000000"/>
                 <w:u w:val="none"/>
-                <w:rtl w:val="0"/>
               </w:rPr>
               <w:t xml:space="preserve">__________                   </w:t>
             </w:r>
             <w:r>
               <w:rPr>
                 <w:color w:val="000000"/>
-                <w:rtl w:val="0"/>
               </w:rPr>
               <w:t xml:space="preserve"> Е. М. Корнякова</w:t>
             </w:r>
@@ -438,7 +418,6 @@
               <w:rPr>
                 <w:color w:val="000000"/>
                 <w:u w:val="none"/>
-                <w:rtl w:val="0"/>
               </w:rPr>
               <w:t xml:space="preserve"> </w:t>
             </w:r>
@@ -446,11 +425,11 @@
           <w:p>
             <w:pPr>
               <w:pBdr>
-                <w:top w:space="0" w:sz="0" w:val="nil"/>
-                <w:left w:space="0" w:sz="0" w:val="nil"/>
-                <w:bottom w:space="0" w:sz="0" w:val="nil"/>
-                <w:right w:space="0" w:sz="0" w:val="nil"/>
-                <w:between w:space="0" w:sz="0" w:val="nil"/>
+                <w:top w:val="none" w:color="auto" w:sz="0" w:space="0"/>
+                <w:left w:val="none" w:color="auto" w:sz="0" w:space="0"/>
+                <w:bottom w:val="none" w:color="auto" w:sz="0" w:space="0"/>
+                <w:right w:val="none" w:color="auto" w:sz="0" w:space="0"/>
+                <w:between w:val="none" w:color="auto" w:sz="0" w:space="0"/>
               </w:pBdr>
               <w:rPr>
                 <w:color w:val="000000"/>
@@ -465,7 +444,6 @@
                 <w:szCs w:val="16"/>
                 <w:u w:val="none"/>
                 <w:vertAlign w:val="superscript"/>
-                <w:rtl w:val="0"/>
               </w:rPr>
               <w:t xml:space="preserve">         </w:t>
             </w:r>
@@ -475,7 +453,6 @@
                 <w:szCs w:val="16"/>
                 <w:u w:val="none"/>
                 <w:vertAlign w:val="superscript"/>
-                <w:rtl w:val="0"/>
               </w:rPr>
               <w:t xml:space="preserve">   </w:t>
             </w:r>
@@ -484,9 +461,8 @@
                 <w:color w:val="000000"/>
                 <w:u w:val="none"/>
                 <w:vertAlign w:val="superscript"/>
-                <w:rtl w:val="0"/>
-              </w:rPr>
-              <w:t xml:space="preserve">Подпись                                                расшифровка подписи</w:t>
+              </w:rPr>
+              <w:t>Подпись                                                расшифровка подписи</w:t>
             </w:r>
           </w:p>
           <w:p>
@@ -497,11 +473,6 @@
                 <w:u w:val="none"/>
               </w:rPr>
             </w:pPr>
-            <w:r>
-              <w:rPr>
-                <w:rtl w:val="0"/>
-              </w:rPr>
-            </w:r>
           </w:p>
         </w:tc>
       </w:tr>
@@ -520,16 +491,12 @@
     <w:p>
       <w:pPr>
         <w:jc w:val="both"/>
-        <w:rPr/>
       </w:pPr>
       <w:r>
         <w:t>Код, наименование направления {{direction_code}} {{direction_name}}</w:t>
       </w:r>
     </w:p>
     <w:p>
-      <w:pPr>
-        <w:rPr/>
-      </w:pPr>
       <w:r>
         <w:t>Наименование образовательной программы/Наименование магистерской программы {{program_name}}</w:t>
       </w:r>
@@ -538,8 +505,8 @@
       <w:pPr>
         <w:jc w:val="center"/>
         <w:rPr>
-          <w:b w:val="1"/>
-          <w:bCs w:val="1"/>
+          <w:b/>
+          <w:bCs/>
           <w:sz w:val="28"/>
           <w:szCs w:val="28"/>
           <w:u w:val="none"/>
@@ -547,20 +514,19 @@
       </w:pPr>
       <w:r>
         <w:rPr>
-          <w:b w:val="1"/>
-          <w:bCs w:val="1"/>
+          <w:b/>
+          <w:bCs/>
           <w:sz w:val="28"/>
           <w:szCs w:val="28"/>
           <w:u w:val="none"/>
-          <w:rtl w:val="0"/>
-        </w:rPr>
-        <w:t xml:space="preserve">ИНДИВИДУАЛЬНОЕ ЗАДАНИЕ</w:t>
+        </w:rPr>
+        <w:t>ИНДИВИДУАЛЬНОЕ ЗАДАНИЕ</w:t>
       </w:r>
     </w:p>
     <w:p>
       <w:pPr>
         <w:pBdr>
-          <w:bottom w:color="000000" w:space="1" w:sz="12" w:val="single"/>
+          <w:bottom w:val="single" w:color="000000" w:sz="12" w:space="1"/>
         </w:pBdr>
         <w:jc w:val="center"/>
         <w:rPr>
@@ -570,20 +536,19 @@
       <w:r>
         <w:rPr>
           <w:u w:val="none"/>
-          <w:rtl w:val="0"/>
-        </w:rPr>
-        <w:t xml:space="preserve">На учебную, производственную (преддипломную) практику студента</w:t>
+        </w:rPr>
+        <w:t>На учебную, производственную (преддипломную) практику студента</w:t>
       </w:r>
     </w:p>
     <w:p>
       <w:pPr>
         <w:pBdr>
-          <w:bottom w:color="000000" w:space="1" w:sz="12" w:val="single"/>
+          <w:bottom w:val="single" w:color="000000" w:sz="12" w:space="1"/>
         </w:pBdr>
         <w:jc w:val="center"/>
         <w:rPr>
-          <w:b w:val="1"/>
-          <w:bCs w:val="1"/>
+          <w:b/>
+          <w:bCs/>
           <w:sz w:val="28"/>
           <w:szCs w:val="28"/>
           <w:u w:val="none"/>
@@ -607,9 +572,8 @@
           <w:sz w:val="16"/>
           <w:szCs w:val="16"/>
           <w:u w:val="none"/>
-          <w:rtl w:val="0"/>
-        </w:rPr>
-        <w:t xml:space="preserve">(фамилия, имя, отчество)</w:t>
+        </w:rPr>
+        <w:t>(фамилия, имя, отчество)</w:t>
       </w:r>
     </w:p>
     <w:p>
@@ -622,12 +586,26 @@
       </w:pPr>
       <w:r>
         <w:t>1. Тема задания на практику «{{practice_topic}}»</w:t>
+      </w:r>
+      <w:r>
         <w:tab/>
+      </w:r>
+      <w:r>
         <w:tab/>
+      </w:r>
+      <w:r>
         <w:tab/>
+      </w:r>
+      <w:r>
         <w:tab/>
+      </w:r>
+      <w:r>
         <w:tab/>
+      </w:r>
+      <w:r>
         <w:tab/>
+      </w:r>
+      <w:r>
         <w:tab/>
       </w:r>
     </w:p>
@@ -646,20 +624,17 @@
     <w:p>
       <w:pPr>
         <w:ind w:right="-136"/>
-        <w:rPr/>
       </w:pPr>
       <w:r>
         <w:rPr>
           <w:u w:val="none"/>
-          <w:rtl w:val="0"/>
         </w:rPr>
         <w:t xml:space="preserve">3. Место прохождения практики: </w:t>
       </w:r>
       <w:r>
-        <w:rPr>
-          <w:rtl w:val="0"/>
-        </w:rPr>
-        <w:t xml:space="preserve">ИП Езуб Антон Сергеевич, удаленное прохождение</w:t>
+        <w:t>ИП Езуб Антон Сергеевич, удаленное прохождение</w:t>
+      </w:r>
+      <w:r>
         <w:tab/>
       </w:r>
     </w:p>
@@ -673,9 +648,8 @@
       <w:r>
         <w:rPr>
           <w:u w:val="none"/>
-          <w:rtl w:val="0"/>
-        </w:rPr>
-        <w:t xml:space="preserve">4. Вид практики: Производственная практика</w:t>
+        </w:rPr>
+        <w:t>4. Вид практики: Производственная практика</w:t>
       </w:r>
     </w:p>
     <w:p>
@@ -688,51 +662,61 @@
       <w:r>
         <w:rPr>
           <w:u w:val="none"/>
-          <w:rtl w:val="0"/>
-        </w:rPr>
-        <w:t xml:space="preserve">5. Тип практики: Производственная практика, технологическая</w:t>
+        </w:rPr>
+        <w:t>5. Тип практики: Производственная практика, технологическая</w:t>
       </w:r>
     </w:p>
     <w:p>
       <w:pPr>
         <w:ind w:right="5"/>
         <w:jc w:val="both"/>
-        <w:rPr/>
       </w:pPr>
       <w:r>
         <w:rPr>
           <w:u w:val="none"/>
-          <w:rtl w:val="0"/>
         </w:rPr>
         <w:t xml:space="preserve">6. Содержание  отчета:   </w:t>
       </w:r>
       <w:r>
-        <w:rPr>
-          <w:rtl w:val="0"/>
-        </w:rPr>
-        <w:t xml:space="preserve">введение,   описание   работы,   результат   практики,  заключение,   список</w:t>
+        <w:t>введение,   описание   работы,   результат   практики,  заключение,   список</w:t>
       </w:r>
     </w:p>
     <w:p>
       <w:pPr>
         <w:ind w:right="-277"/>
         <w:jc w:val="both"/>
-        <w:rPr/>
       </w:pPr>
       <w:r>
-        <w:rPr>
-          <w:rtl w:val="0"/>
-        </w:rPr>
-        <w:t xml:space="preserve">использованных источников</w:t>
+        <w:t>использованных источников</w:t>
+      </w:r>
+      <w:r>
         <w:tab/>
+      </w:r>
+      <w:r>
         <w:tab/>
+      </w:r>
+      <w:r>
         <w:tab/>
+      </w:r>
+      <w:r>
         <w:tab/>
+      </w:r>
+      <w:r>
         <w:tab/>
+      </w:r>
+      <w:r>
         <w:tab/>
+      </w:r>
+      <w:r>
         <w:tab/>
+      </w:r>
+      <w:r>
         <w:tab/>
+      </w:r>
+      <w:r>
         <w:tab/>
+      </w:r>
+      <w:r>
         <w:tab/>
       </w:r>
     </w:p>
@@ -740,8 +724,8 @@
       <w:pPr>
         <w:jc w:val="center"/>
         <w:rPr>
-          <w:b w:val="1"/>
-          <w:bCs w:val="1"/>
+          <w:b/>
+          <w:bCs/>
           <w:sz w:val="24"/>
           <w:szCs w:val="24"/>
           <w:u w:val="none"/>
@@ -749,54 +733,63 @@
       </w:pPr>
       <w:r>
         <w:rPr>
-          <w:b w:val="1"/>
-          <w:bCs w:val="1"/>
+          <w:b/>
+          <w:bCs/>
           <w:sz w:val="24"/>
           <w:szCs w:val="24"/>
           <w:u w:val="none"/>
-          <w:rtl w:val="0"/>
-        </w:rPr>
-        <w:t xml:space="preserve">Рабочий график (план) проведения практики</w:t>
+        </w:rPr>
+        <w:t>Рабочий график (план) проведения практики</w:t>
       </w:r>
     </w:p>
     <w:tbl>
       <w:tblPr>
-        <w:tblStyle w:val="Table2"/>
-        <w:tblW w:w="10170.0" w:type="dxa"/>
-        <w:jc w:val="left"/>
-        <w:tblInd w:w="-548.0" w:type="dxa"/>
+        <w:tblStyle w:val="14"/>
+        <w:tblW w:w="10170" w:type="dxa"/>
+        <w:tblInd w:w="-548" w:type="dxa"/>
         <w:tblBorders>
-          <w:top w:color="000000" w:space="0" w:sz="4" w:val="single"/>
-          <w:left w:color="000000" w:space="0" w:sz="4" w:val="single"/>
-          <w:bottom w:color="000000" w:space="0" w:sz="4" w:val="single"/>
-          <w:right w:color="000000" w:space="0" w:sz="4" w:val="single"/>
-          <w:insideH w:color="000000" w:space="0" w:sz="4" w:val="single"/>
-          <w:insideV w:color="000000" w:space="0" w:sz="4" w:val="single"/>
+          <w:top w:val="single" w:color="000000" w:sz="4" w:space="0"/>
+          <w:left w:val="single" w:color="000000" w:sz="4" w:space="0"/>
+          <w:bottom w:val="single" w:color="000000" w:sz="4" w:space="0"/>
+          <w:right w:val="single" w:color="000000" w:sz="4" w:space="0"/>
+          <w:insideH w:val="single" w:color="000000" w:sz="4" w:space="0"/>
+          <w:insideV w:val="single" w:color="000000" w:sz="4" w:space="0"/>
         </w:tblBorders>
         <w:tblLayout w:type="fixed"/>
-        <w:tblLook w:val="0000"/>
+        <w:tblCellMar>
+          <w:top w:w="0" w:type="dxa"/>
+          <w:left w:w="115" w:type="dxa"/>
+          <w:bottom w:w="0" w:type="dxa"/>
+          <w:right w:w="115" w:type="dxa"/>
+        </w:tblCellMar>
       </w:tblPr>
       <w:tblGrid>
         <w:gridCol w:w="2055"/>
         <w:gridCol w:w="5190"/>
         <w:gridCol w:w="1515"/>
         <w:gridCol w:w="1410"/>
-        <w:tblGridChange w:id="0">
-          <w:tblGrid>
-            <w:gridCol w:w="2055"/>
-            <w:gridCol w:w="5190"/>
-            <w:gridCol w:w="1515"/>
-            <w:gridCol w:w="1410"/>
-          </w:tblGrid>
-        </w:tblGridChange>
       </w:tblGrid>
       <w:tr>
-        <w:trPr>
-          <w:cantSplit w:val="0"/>
-          <w:tblHeader w:val="0"/>
-        </w:trPr>
+        <w:tblPrEx>
+          <w:tblBorders>
+            <w:top w:val="single" w:color="000000" w:sz="4" w:space="0"/>
+            <w:left w:val="single" w:color="000000" w:sz="4" w:space="0"/>
+            <w:bottom w:val="single" w:color="000000" w:sz="4" w:space="0"/>
+            <w:right w:val="single" w:color="000000" w:sz="4" w:space="0"/>
+            <w:insideH w:val="single" w:color="000000" w:sz="4" w:space="0"/>
+            <w:insideV w:val="single" w:color="000000" w:sz="4" w:space="0"/>
+          </w:tblBorders>
+          <w:tblCellMar>
+            <w:top w:w="0" w:type="dxa"/>
+            <w:left w:w="115" w:type="dxa"/>
+            <w:bottom w:w="0" w:type="dxa"/>
+            <w:right w:w="115" w:type="dxa"/>
+          </w:tblCellMar>
+        </w:tblPrEx>
         <w:tc>
-          <w:tcPr/>
+          <w:tcPr>
+            <w:tcW w:w="2055" w:type="dxa"/>
+          </w:tcPr>
           <w:p>
             <w:pPr>
               <w:jc w:val="center"/>
@@ -808,123 +801,135 @@
             </w:pPr>
             <w:r>
               <w:rPr>
-                <w:b w:val="1"/>
-                <w:bCs w:val="1"/>
-                <w:i w:val="1"/>
-                <w:iCs w:val="1"/>
-                <w:sz w:val="18"/>
-                <w:szCs w:val="18"/>
-                <w:u w:val="none"/>
-                <w:rtl w:val="0"/>
-              </w:rPr>
-              <w:t xml:space="preserve">Этапы практики</w:t>
-            </w:r>
-            <w:r>
-              <w:rPr>
-                <w:rtl w:val="0"/>
-              </w:rPr>
+                <w:b/>
+                <w:bCs/>
+                <w:i/>
+                <w:iCs/>
+                <w:sz w:val="18"/>
+                <w:szCs w:val="18"/>
+                <w:u w:val="none"/>
+              </w:rPr>
+              <w:t>Этапы практики</w:t>
             </w:r>
           </w:p>
         </w:tc>
         <w:tc>
-          <w:tcPr/>
+          <w:tcPr>
+            <w:tcW w:w="5190" w:type="dxa"/>
+          </w:tcPr>
           <w:p>
             <w:pPr>
               <w:jc w:val="center"/>
               <w:rPr>
-                <w:b w:val="1"/>
-                <w:bCs w:val="1"/>
-                <w:i w:val="1"/>
-                <w:iCs w:val="1"/>
-                <w:sz w:val="18"/>
-                <w:szCs w:val="18"/>
-                <w:u w:val="none"/>
-              </w:rPr>
-            </w:pPr>
-            <w:r>
-              <w:rPr>
-                <w:b w:val="1"/>
-                <w:bCs w:val="1"/>
-                <w:i w:val="1"/>
-                <w:iCs w:val="1"/>
-                <w:sz w:val="18"/>
-                <w:szCs w:val="18"/>
-                <w:u w:val="none"/>
-                <w:rtl w:val="0"/>
-              </w:rPr>
-              <w:t xml:space="preserve">Наименование  работ студента</w:t>
+                <w:b/>
+                <w:bCs/>
+                <w:i/>
+                <w:iCs/>
+                <w:sz w:val="18"/>
+                <w:szCs w:val="18"/>
+                <w:u w:val="none"/>
+              </w:rPr>
+            </w:pPr>
+            <w:r>
+              <w:rPr>
+                <w:b/>
+                <w:bCs/>
+                <w:i/>
+                <w:iCs/>
+                <w:sz w:val="18"/>
+                <w:szCs w:val="18"/>
+                <w:u w:val="none"/>
+              </w:rPr>
+              <w:t>Наименование  работ студента</w:t>
             </w:r>
           </w:p>
         </w:tc>
         <w:tc>
-          <w:tcPr/>
+          <w:tcPr>
+            <w:tcW w:w="1515" w:type="dxa"/>
+          </w:tcPr>
           <w:p>
             <w:pPr>
               <w:jc w:val="center"/>
               <w:rPr>
-                <w:b w:val="1"/>
-                <w:bCs w:val="1"/>
-                <w:i w:val="1"/>
-                <w:iCs w:val="1"/>
-                <w:sz w:val="18"/>
-                <w:szCs w:val="18"/>
-                <w:u w:val="none"/>
-              </w:rPr>
-            </w:pPr>
-            <w:r>
-              <w:rPr>
-                <w:b w:val="1"/>
-                <w:bCs w:val="1"/>
-                <w:i w:val="1"/>
-                <w:iCs w:val="1"/>
-                <w:sz w:val="18"/>
-                <w:szCs w:val="18"/>
-                <w:u w:val="none"/>
-                <w:rtl w:val="0"/>
-              </w:rPr>
-              <w:t xml:space="preserve">Срок</w:t>
+                <w:b/>
+                <w:bCs/>
+                <w:i/>
+                <w:iCs/>
+                <w:sz w:val="18"/>
+                <w:szCs w:val="18"/>
+                <w:u w:val="none"/>
+              </w:rPr>
+            </w:pPr>
+            <w:r>
+              <w:rPr>
+                <w:b/>
+                <w:bCs/>
+                <w:i/>
+                <w:iCs/>
+                <w:sz w:val="18"/>
+                <w:szCs w:val="18"/>
+                <w:u w:val="none"/>
+              </w:rPr>
+              <w:t>Срок</w:t>
             </w:r>
           </w:p>
         </w:tc>
         <w:tc>
-          <w:tcPr/>
+          <w:tcPr>
+            <w:tcW w:w="1410" w:type="dxa"/>
+          </w:tcPr>
           <w:p>
             <w:pPr>
               <w:jc w:val="center"/>
               <w:rPr>
-                <w:b w:val="1"/>
-                <w:bCs w:val="1"/>
-                <w:i w:val="1"/>
-                <w:iCs w:val="1"/>
-                <w:sz w:val="18"/>
-                <w:szCs w:val="18"/>
-                <w:u w:val="none"/>
-              </w:rPr>
-            </w:pPr>
-            <w:r>
-              <w:rPr>
-                <w:b w:val="1"/>
-                <w:bCs w:val="1"/>
-                <w:i w:val="1"/>
-                <w:iCs w:val="1"/>
-                <w:sz w:val="18"/>
-                <w:szCs w:val="18"/>
-                <w:u w:val="none"/>
-                <w:rtl w:val="0"/>
-              </w:rPr>
-              <w:t xml:space="preserve">Примечание</w:t>
+                <w:b/>
+                <w:bCs/>
+                <w:i/>
+                <w:iCs/>
+                <w:sz w:val="18"/>
+                <w:szCs w:val="18"/>
+                <w:u w:val="none"/>
+              </w:rPr>
+            </w:pPr>
+            <w:r>
+              <w:rPr>
+                <w:b/>
+                <w:bCs/>
+                <w:i/>
+                <w:iCs/>
+                <w:sz w:val="18"/>
+                <w:szCs w:val="18"/>
+                <w:u w:val="none"/>
+              </w:rPr>
+              <w:t>Примечание</w:t>
             </w:r>
           </w:p>
         </w:tc>
       </w:tr>
       <w:tr>
+        <w:tblPrEx>
+          <w:tblBorders>
+            <w:top w:val="single" w:color="000000" w:sz="4" w:space="0"/>
+            <w:left w:val="single" w:color="000000" w:sz="4" w:space="0"/>
+            <w:bottom w:val="single" w:color="000000" w:sz="4" w:space="0"/>
+            <w:right w:val="single" w:color="000000" w:sz="4" w:space="0"/>
+            <w:insideH w:val="single" w:color="000000" w:sz="4" w:space="0"/>
+            <w:insideV w:val="single" w:color="000000" w:sz="4" w:space="0"/>
+          </w:tblBorders>
+          <w:tblCellMar>
+            <w:top w:w="0" w:type="dxa"/>
+            <w:left w:w="115" w:type="dxa"/>
+            <w:bottom w:w="0" w:type="dxa"/>
+            <w:right w:w="115" w:type="dxa"/>
+          </w:tblCellMar>
+        </w:tblPrEx>
         <w:trPr>
-          <w:cantSplit w:val="0"/>
           <w:trHeight w:val="1952" w:hRule="atLeast"/>
-          <w:tblHeader w:val="0"/>
         </w:trPr>
         <w:tc>
           <w:tcPr>
+            <w:tcW w:w="2055" w:type="dxa"/>
             <w:vAlign w:val="center"/>
           </w:tcPr>
           <w:p>
@@ -940,91 +945,36 @@
                 <w:sz w:val="18"/>
                 <w:szCs w:val="18"/>
                 <w:u w:val="none"/>
-                <w:rtl w:val="0"/>
-              </w:rPr>
-              <w:t xml:space="preserve">Организационный</w:t>
-            </w:r>
-          </w:p>
-        </w:tc>
-        <w:tc>
-          <w:tcPr/>
-          <w:p>
-            <w:pPr>
-              <w:rPr>
-                <w:sz w:val="18"/>
-                <w:szCs w:val="18"/>
-                <w:u w:val="none"/>
-              </w:rPr>
-            </w:pPr>
-            <w:r>
-              <w:rPr>
-                <w:sz w:val="18"/>
-                <w:szCs w:val="18"/>
-                <w:u w:val="none"/>
-                <w:rtl w:val="0"/>
-              </w:rPr>
-              <w:t xml:space="preserve">Усвоение правил внутреннего трудового распорядка Профильной организации; правил по охране труда и технике безопасности, санитарно-эпидемиологических правил, режима конфиденциальности, принятого в Профильной организации. Обсуждение с руководителем практики от Профильной организации темы индивидуального задания на практическую подготовку в организации, уточнение ее формулировки, составление конкретного последовательного перечня работ, необходимых для выполнения задания.</w:t>
+              </w:rPr>
+              <w:t>Организационный</w:t>
             </w:r>
           </w:p>
         </w:tc>
         <w:tc>
           <w:tcPr>
-            <w:vAlign w:val="center"/>
+            <w:tcW w:w="5190" w:type="dxa"/>
           </w:tcPr>
           <w:p>
             <w:pPr>
-              <w:jc w:val="center"/>
-              <w:rPr>
-                <w:sz w:val="18"/>
-                <w:szCs w:val="18"/>
-                <w:u w:val="none"/>
-              </w:rPr>
-            </w:pPr>
-            <w:r>
-              <w:t>с   {{practice_start}}</w:t>
-            </w:r>
-          </w:p>
-          <w:p>
-            <w:pPr>
-              <w:jc w:val="center"/>
-              <w:rPr>
-                <w:sz w:val="18"/>
-                <w:szCs w:val="18"/>
-                <w:u w:val="none"/>
-              </w:rPr>
-            </w:pPr>
-            <w:r>
-              <w:rPr>
-                <w:sz w:val="18"/>
-                <w:szCs w:val="18"/>
-                <w:u w:val="none"/>
-                <w:rtl w:val="0"/>
-              </w:rPr>
-              <w:t xml:space="preserve">(дата начала    практики)</w:t>
-            </w:r>
-          </w:p>
-          <w:p>
-            <w:pPr>
-              <w:jc w:val="center"/>
-              <w:rPr>
-                <w:sz w:val="18"/>
-                <w:szCs w:val="18"/>
-                <w:u w:val="none"/>
-              </w:rPr>
-            </w:pPr>
-            <w:r>
-              <w:rPr>
-                <w:sz w:val="18"/>
-                <w:szCs w:val="18"/>
-                <w:u w:val="none"/>
-                <w:rtl w:val="0"/>
-              </w:rPr>
-              <w:t xml:space="preserve">по 06.07.2026</w:t>
+              <w:rPr>
+                <w:sz w:val="18"/>
+                <w:szCs w:val="18"/>
+                <w:u w:val="none"/>
+              </w:rPr>
+            </w:pPr>
+            <w:r>
+              <w:rPr>
+                <w:sz w:val="18"/>
+                <w:szCs w:val="18"/>
+                <w:u w:val="none"/>
+              </w:rPr>
+              <w:t>Усвоение правил внутреннего трудового распорядка Профильной организации; правил по охране труда и технике безопасности, санитарно-эпидемиологических правил, режима конфиденциальности, принятого в Профильной организации. Обсуждение с руководителем практики от Профильной организации темы индивидуального задания на практическую подготовку в организации, уточнение ее формулировки, составление конкретного последовательного перечня работ, необходимых для выполнения задания.</w:t>
             </w:r>
           </w:p>
         </w:tc>
         <w:tc>
           <w:tcPr>
+            <w:tcW w:w="1515" w:type="dxa"/>
             <w:vAlign w:val="center"/>
           </w:tcPr>
           <w:p>
@@ -1040,22 +990,118 @@
               <w:rPr>
                 <w:sz w:val="18"/>
                 <w:szCs w:val="18"/>
-                <w:u w:val="none"/>
-                <w:rtl w:val="0"/>
-              </w:rPr>
-              <w:t xml:space="preserve">Выполнено</w:t>
+              </w:rPr>
+              <w:t>с   {{practice_start}}</w:t>
+            </w:r>
+          </w:p>
+          <w:p>
+            <w:pPr>
+              <w:jc w:val="center"/>
+              <w:rPr>
+                <w:sz w:val="18"/>
+                <w:szCs w:val="18"/>
+                <w:u w:val="none"/>
+              </w:rPr>
+            </w:pPr>
+            <w:r>
+              <w:rPr>
+                <w:sz w:val="18"/>
+                <w:szCs w:val="18"/>
+                <w:u w:val="none"/>
+              </w:rPr>
+              <w:t>(дата начала    практики)</w:t>
+            </w:r>
+          </w:p>
+          <w:p>
+            <w:pPr>
+              <w:jc w:val="center"/>
+              <w:rPr>
+                <w:sz w:val="18"/>
+                <w:szCs w:val="18"/>
+                <w:u w:val="none"/>
+              </w:rPr>
+            </w:pPr>
+            <w:r>
+              <w:rPr>
+                <w:sz w:val="18"/>
+                <w:szCs w:val="18"/>
+                <w:u w:val="none"/>
+              </w:rPr>
+              <w:t xml:space="preserve">по </w:t>
+            </w:r>
+            <w:r>
+              <w:rPr>
+                <w:sz w:val="18"/>
+                <w:szCs w:val="18"/>
+              </w:rPr>
+              <w:t>{{practice</w:t>
+            </w:r>
+            <w:r>
+              <w:rPr>
+                <w:rFonts w:hint="default"/>
+                <w:sz w:val="18"/>
+                <w:szCs w:val="18"/>
+                <w:lang w:val="en-US"/>
+              </w:rPr>
+              <w:t>_stage1_finish</w:t>
+            </w:r>
+            <w:r>
+              <w:rPr>
+                <w:sz w:val="18"/>
+                <w:szCs w:val="18"/>
+              </w:rPr>
+              <w:t>}}</w:t>
+            </w:r>
+          </w:p>
+        </w:tc>
+        <w:tc>
+          <w:tcPr>
+            <w:tcW w:w="1410" w:type="dxa"/>
+            <w:vAlign w:val="center"/>
+          </w:tcPr>
+          <w:p>
+            <w:pPr>
+              <w:jc w:val="center"/>
+              <w:rPr>
+                <w:sz w:val="18"/>
+                <w:szCs w:val="18"/>
+                <w:u w:val="none"/>
+              </w:rPr>
+            </w:pPr>
+            <w:r>
+              <w:rPr>
+                <w:sz w:val="18"/>
+                <w:szCs w:val="18"/>
+                <w:u w:val="none"/>
+              </w:rPr>
+              <w:t>Выполнено</w:t>
             </w:r>
           </w:p>
         </w:tc>
       </w:tr>
       <w:tr>
+        <w:tblPrEx>
+          <w:tblBorders>
+            <w:top w:val="single" w:color="000000" w:sz="4" w:space="0"/>
+            <w:left w:val="single" w:color="000000" w:sz="4" w:space="0"/>
+            <w:bottom w:val="single" w:color="000000" w:sz="4" w:space="0"/>
+            <w:right w:val="single" w:color="000000" w:sz="4" w:space="0"/>
+            <w:insideH w:val="single" w:color="000000" w:sz="4" w:space="0"/>
+            <w:insideV w:val="single" w:color="000000" w:sz="4" w:space="0"/>
+          </w:tblBorders>
+          <w:tblCellMar>
+            <w:top w:w="0" w:type="dxa"/>
+            <w:left w:w="115" w:type="dxa"/>
+            <w:bottom w:w="0" w:type="dxa"/>
+            <w:right w:w="115" w:type="dxa"/>
+          </w:tblCellMar>
+        </w:tblPrEx>
         <w:trPr>
-          <w:cantSplit w:val="0"/>
           <w:trHeight w:val="1200" w:hRule="atLeast"/>
-          <w:tblHeader w:val="0"/>
         </w:trPr>
         <w:tc>
           <w:tcPr>
+            <w:tcW w:w="2055" w:type="dxa"/>
             <w:vAlign w:val="center"/>
           </w:tcPr>
           <w:p>
@@ -1071,83 +1117,51 @@
                 <w:sz w:val="18"/>
                 <w:szCs w:val="18"/>
                 <w:u w:val="none"/>
-                <w:rtl w:val="0"/>
-              </w:rPr>
-              <w:t xml:space="preserve">Основной</w:t>
-            </w:r>
-          </w:p>
-        </w:tc>
-        <w:tc>
-          <w:tcPr/>
-          <w:p>
-            <w:pPr>
-              <w:rPr>
-                <w:sz w:val="18"/>
-                <w:szCs w:val="18"/>
-                <w:u w:val="none"/>
-              </w:rPr>
-            </w:pPr>
-            <w:r>
-              <w:rPr>
-                <w:sz w:val="18"/>
-                <w:szCs w:val="18"/>
-                <w:u w:val="none"/>
-                <w:rtl w:val="0"/>
-              </w:rPr>
-              <w:t xml:space="preserve">Выполнение индивидуального задания по следующему перечню работ: </w:t>
-            </w:r>
-          </w:p>
-          <w:p>
-            <w:r>
-              <w:t>{{main_stage_tasks}}</w:t>
+              </w:rPr>
+              <w:t>Основной</w:t>
             </w:r>
           </w:p>
         </w:tc>
         <w:tc>
           <w:tcPr>
-            <w:vAlign w:val="center"/>
+            <w:tcW w:w="5190" w:type="dxa"/>
           </w:tcPr>
           <w:p>
             <w:pPr>
-              <w:jc w:val="center"/>
-              <w:rPr>
-                <w:sz w:val="18"/>
-                <w:szCs w:val="18"/>
-                <w:u w:val="none"/>
-              </w:rPr>
-            </w:pPr>
-            <w:r>
-              <w:rPr>
-                <w:sz w:val="18"/>
-                <w:szCs w:val="18"/>
-                <w:u w:val="none"/>
-                <w:rtl w:val="0"/>
-              </w:rPr>
-              <w:t xml:space="preserve">с   06.07.2026</w:t>
-            </w:r>
-          </w:p>
-          <w:p>
-            <w:pPr>
-              <w:jc w:val="center"/>
-              <w:rPr>
-                <w:sz w:val="18"/>
-                <w:szCs w:val="18"/>
-                <w:u w:val="none"/>
-              </w:rPr>
-            </w:pPr>
-            <w:r>
-              <w:rPr>
-                <w:sz w:val="18"/>
-                <w:szCs w:val="18"/>
-                <w:u w:val="none"/>
-                <w:rtl w:val="0"/>
-              </w:rPr>
-              <w:t xml:space="preserve">по 22.07.2026</w:t>
+              <w:rPr>
+                <w:sz w:val="18"/>
+                <w:szCs w:val="18"/>
+                <w:u w:val="none"/>
+              </w:rPr>
+            </w:pPr>
+            <w:r>
+              <w:rPr>
+                <w:sz w:val="18"/>
+                <w:szCs w:val="18"/>
+                <w:u w:val="none"/>
+              </w:rPr>
+              <w:t xml:space="preserve">Выполнение индивидуального задания по следующему перечню работ: </w:t>
+            </w:r>
+          </w:p>
+          <w:p>
+            <w:pPr>
+              <w:rPr>
+                <w:sz w:val="18"/>
+                <w:szCs w:val="18"/>
+              </w:rPr>
+            </w:pPr>
+            <w:r>
+              <w:rPr>
+                <w:sz w:val="18"/>
+                <w:szCs w:val="18"/>
+              </w:rPr>
+              <w:t>{{main_stage_tasks}}</w:t>
             </w:r>
           </w:p>
         </w:tc>
         <w:tc>
           <w:tcPr>
+            <w:tcW w:w="1515" w:type="dxa"/>
             <w:vAlign w:val="center"/>
           </w:tcPr>
           <w:p>
@@ -1157,28 +1171,168 @@
                 <w:sz w:val="18"/>
                 <w:szCs w:val="18"/>
                 <w:u w:val="none"/>
-              </w:rPr>
-            </w:pPr>
-            <w:r>
-              <w:rPr>
-                <w:sz w:val="18"/>
-                <w:szCs w:val="18"/>
-                <w:u w:val="none"/>
-                <w:rtl w:val="0"/>
-              </w:rPr>
-              <w:t xml:space="preserve">Выполнено</w:t>
+                <w:lang w:val="en-US"/>
+              </w:rPr>
+            </w:pPr>
+            <w:r>
+              <w:rPr>
+                <w:sz w:val="18"/>
+                <w:szCs w:val="18"/>
+                <w:u w:val="none"/>
+              </w:rPr>
+              <w:t>с</w:t>
+            </w:r>
+            <w:r>
+              <w:rPr>
+                <w:sz w:val="18"/>
+                <w:szCs w:val="18"/>
+                <w:u w:val="none"/>
+                <w:lang w:val="en-US"/>
+              </w:rPr>
+              <w:t xml:space="preserve">   </w:t>
+            </w:r>
+            <w:r>
+              <w:rPr>
+                <w:sz w:val="18"/>
+                <w:szCs w:val="18"/>
+                <w:lang w:val="en-US"/>
+              </w:rPr>
+              <w:t>{{</w:t>
+            </w:r>
+            <w:r>
+              <w:rPr>
+                <w:sz w:val="18"/>
+                <w:szCs w:val="18"/>
+              </w:rPr>
+              <w:t>practice</w:t>
+            </w:r>
+            <w:r>
+              <w:rPr>
+                <w:rFonts w:hint="default"/>
+                <w:sz w:val="18"/>
+                <w:szCs w:val="18"/>
+                <w:lang w:val="en-US"/>
+              </w:rPr>
+              <w:t>_stage1_finish</w:t>
+            </w:r>
+            <w:r>
+              <w:rPr>
+                <w:sz w:val="18"/>
+                <w:szCs w:val="18"/>
+                <w:lang w:val="en-US"/>
+              </w:rPr>
+              <w:t>}}</w:t>
+            </w:r>
+          </w:p>
+          <w:p>
+            <w:pPr>
+              <w:jc w:val="center"/>
+              <w:rPr>
+                <w:sz w:val="18"/>
+                <w:szCs w:val="18"/>
+                <w:u w:val="none"/>
+                <w:lang w:val="en-US"/>
+              </w:rPr>
+            </w:pPr>
+            <w:r>
+              <w:rPr>
+                <w:sz w:val="18"/>
+                <w:szCs w:val="18"/>
+                <w:u w:val="none"/>
+              </w:rPr>
+              <w:t>по</w:t>
+            </w:r>
+            <w:r>
+              <w:rPr>
+                <w:sz w:val="18"/>
+                <w:szCs w:val="18"/>
+                <w:u w:val="none"/>
+                <w:lang w:val="en-US"/>
+              </w:rPr>
+              <w:t xml:space="preserve"> </w:t>
+            </w:r>
+            <w:r>
+              <w:rPr>
+                <w:sz w:val="18"/>
+                <w:szCs w:val="18"/>
+                <w:lang w:val="en-US"/>
+              </w:rPr>
+              <w:t>{{</w:t>
+            </w:r>
+            <w:r>
+              <w:rPr>
+                <w:sz w:val="18"/>
+                <w:szCs w:val="18"/>
+              </w:rPr>
+              <w:t>practice</w:t>
+            </w:r>
+            <w:r>
+              <w:rPr>
+                <w:rFonts w:hint="default"/>
+                <w:sz w:val="18"/>
+                <w:szCs w:val="18"/>
+                <w:lang w:val="en-US"/>
+              </w:rPr>
+              <w:t>_stage2_finish</w:t>
+            </w:r>
+            <w:r>
+              <w:rPr>
+                <w:sz w:val="18"/>
+                <w:szCs w:val="18"/>
+                <w:lang w:val="en-US"/>
+              </w:rPr>
+              <w:t>}}</w:t>
+            </w:r>
+          </w:p>
+        </w:tc>
+        <w:tc>
+          <w:tcPr>
+            <w:tcW w:w="1410" w:type="dxa"/>
+            <w:vAlign w:val="center"/>
+          </w:tcPr>
+          <w:p>
+            <w:pPr>
+              <w:jc w:val="center"/>
+              <w:rPr>
+                <w:sz w:val="18"/>
+                <w:szCs w:val="18"/>
+                <w:u w:val="none"/>
+              </w:rPr>
+            </w:pPr>
+            <w:r>
+              <w:rPr>
+                <w:sz w:val="18"/>
+                <w:szCs w:val="18"/>
+                <w:u w:val="none"/>
+              </w:rPr>
+              <w:t>Выполнено</w:t>
             </w:r>
           </w:p>
         </w:tc>
       </w:tr>
       <w:tr>
+        <w:tblPrEx>
+          <w:tblBorders>
+            <w:top w:val="single" w:color="000000" w:sz="4" w:space="0"/>
+            <w:left w:val="single" w:color="000000" w:sz="4" w:space="0"/>
+            <w:bottom w:val="single" w:color="000000" w:sz="4" w:space="0"/>
+            <w:right w:val="single" w:color="000000" w:sz="4" w:space="0"/>
+            <w:insideH w:val="single" w:color="000000" w:sz="4" w:space="0"/>
+            <w:insideV w:val="single" w:color="000000" w:sz="4" w:space="0"/>
+          </w:tblBorders>
+          <w:tblCellMar>
+            <w:top w:w="0" w:type="dxa"/>
+            <w:left w:w="115" w:type="dxa"/>
+            <w:bottom w:w="0" w:type="dxa"/>
+            <w:right w:w="115" w:type="dxa"/>
+          </w:tblCellMar>
+        </w:tblPrEx>
         <w:trPr>
-          <w:cantSplit w:val="0"/>
           <w:trHeight w:val="1619" w:hRule="atLeast"/>
-          <w:tblHeader w:val="0"/>
         </w:trPr>
         <w:tc>
           <w:tcPr>
+            <w:tcW w:w="2055" w:type="dxa"/>
             <w:vAlign w:val="center"/>
           </w:tcPr>
           <w:p>
@@ -1194,91 +1348,36 @@
                 <w:sz w:val="18"/>
                 <w:szCs w:val="18"/>
                 <w:u w:val="none"/>
-                <w:rtl w:val="0"/>
-              </w:rPr>
-              <w:t xml:space="preserve">Заключительный</w:t>
-            </w:r>
-          </w:p>
-        </w:tc>
-        <w:tc>
-          <w:tcPr/>
-          <w:p>
-            <w:pPr>
-              <w:rPr>
-                <w:sz w:val="18"/>
-                <w:szCs w:val="18"/>
-                <w:u w:val="none"/>
-              </w:rPr>
-            </w:pPr>
-            <w:r>
-              <w:rPr>
-                <w:sz w:val="18"/>
-                <w:szCs w:val="18"/>
-                <w:u w:val="none"/>
-                <w:rtl w:val="0"/>
-              </w:rPr>
-              <w:t xml:space="preserve">Составление структуры и написание полного отчета о выполнении индивидуального задания на практическую подготовку в Профильной организации, в соответствии с требованиями шаблонов УрФУ. Согласование отчета с руководителем практики. Получение Отзыва на прохождение практической подготовки и документа к Отзыву от Профильной организации. </w:t>
+              </w:rPr>
+              <w:t>Заключительный</w:t>
             </w:r>
           </w:p>
         </w:tc>
         <w:tc>
           <w:tcPr>
-            <w:vAlign w:val="center"/>
+            <w:tcW w:w="5190" w:type="dxa"/>
           </w:tcPr>
           <w:p>
             <w:pPr>
-              <w:jc w:val="center"/>
-              <w:rPr>
-                <w:sz w:val="18"/>
-                <w:szCs w:val="18"/>
-                <w:u w:val="none"/>
-              </w:rPr>
-            </w:pPr>
-            <w:r>
-              <w:rPr>
-                <w:sz w:val="18"/>
-                <w:szCs w:val="18"/>
-                <w:u w:val="none"/>
-                <w:rtl w:val="0"/>
-              </w:rPr>
-              <w:t xml:space="preserve">с   23.07.2026</w:t>
-            </w:r>
-          </w:p>
-          <w:p>
-            <w:pPr>
-              <w:jc w:val="center"/>
-              <w:rPr>
-                <w:sz w:val="18"/>
-                <w:szCs w:val="18"/>
-                <w:u w:val="none"/>
-              </w:rPr>
-            </w:pPr>
-            <w:r>
-              <w:t>по {{practice_end}}</w:t>
-            </w:r>
-          </w:p>
-          <w:p>
-            <w:pPr>
-              <w:jc w:val="center"/>
-              <w:rPr>
-                <w:sz w:val="18"/>
-                <w:szCs w:val="18"/>
-                <w:u w:val="none"/>
-              </w:rPr>
-            </w:pPr>
-            <w:r>
-              <w:rPr>
-                <w:sz w:val="18"/>
-                <w:szCs w:val="18"/>
-                <w:u w:val="none"/>
-                <w:rtl w:val="0"/>
-              </w:rPr>
-              <w:t xml:space="preserve">(дата окончания практики)</w:t>
+              <w:rPr>
+                <w:sz w:val="18"/>
+                <w:szCs w:val="18"/>
+                <w:u w:val="none"/>
+              </w:rPr>
+            </w:pPr>
+            <w:r>
+              <w:rPr>
+                <w:sz w:val="18"/>
+                <w:szCs w:val="18"/>
+                <w:u w:val="none"/>
+              </w:rPr>
+              <w:t xml:space="preserve">Составление структуры и написание полного отчета о выполнении индивидуального задания на практическую подготовку в Профильной организации, в соответствии с требованиями шаблонов УрФУ. Согласование отчета с руководителем практики. Получение Отзыва на прохождение практической подготовки и документа к Отзыву от Профильной организации. </w:t>
             </w:r>
           </w:p>
         </w:tc>
         <w:tc>
           <w:tcPr>
+            <w:tcW w:w="1515" w:type="dxa"/>
             <w:vAlign w:val="center"/>
           </w:tcPr>
           <w:p>
@@ -1295,9 +1394,101 @@
                 <w:sz w:val="18"/>
                 <w:szCs w:val="18"/>
                 <w:u w:val="none"/>
-                <w:rtl w:val="0"/>
-              </w:rPr>
-              <w:t xml:space="preserve">Выполнено</w:t>
+              </w:rPr>
+              <w:t xml:space="preserve">с   </w:t>
+            </w:r>
+            <w:r>
+              <w:rPr>
+                <w:sz w:val="18"/>
+                <w:szCs w:val="18"/>
+                <w:lang w:val="en-US"/>
+              </w:rPr>
+              <w:t>{{</w:t>
+            </w:r>
+            <w:r>
+              <w:rPr>
+                <w:sz w:val="18"/>
+                <w:szCs w:val="18"/>
+              </w:rPr>
+              <w:t>practice</w:t>
+            </w:r>
+            <w:r>
+              <w:rPr>
+                <w:rFonts w:hint="default"/>
+                <w:sz w:val="18"/>
+                <w:szCs w:val="18"/>
+                <w:lang w:val="en-US"/>
+              </w:rPr>
+              <w:t>_stage3_start</w:t>
+            </w:r>
+            <w:bookmarkStart w:id="1" w:name="_GoBack"/>
+            <w:bookmarkEnd w:id="1"/>
+            <w:r>
+              <w:rPr>
+                <w:sz w:val="18"/>
+                <w:szCs w:val="18"/>
+                <w:lang w:val="en-US"/>
+              </w:rPr>
+              <w:t>}}</w:t>
+            </w:r>
+          </w:p>
+          <w:p>
+            <w:pPr>
+              <w:jc w:val="center"/>
+              <w:rPr>
+                <w:sz w:val="18"/>
+                <w:szCs w:val="18"/>
+                <w:u w:val="none"/>
+              </w:rPr>
+            </w:pPr>
+            <w:r>
+              <w:rPr>
+                <w:sz w:val="18"/>
+                <w:szCs w:val="18"/>
+              </w:rPr>
+              <w:t>по {{practice_end}}</w:t>
+            </w:r>
+          </w:p>
+          <w:p>
+            <w:pPr>
+              <w:jc w:val="center"/>
+              <w:rPr>
+                <w:sz w:val="18"/>
+                <w:szCs w:val="18"/>
+                <w:u w:val="none"/>
+              </w:rPr>
+            </w:pPr>
+            <w:r>
+              <w:rPr>
+                <w:sz w:val="18"/>
+                <w:szCs w:val="18"/>
+                <w:u w:val="none"/>
+              </w:rPr>
+              <w:t>(дата окончания практики)</w:t>
+            </w:r>
+          </w:p>
+        </w:tc>
+        <w:tc>
+          <w:tcPr>
+            <w:tcW w:w="1410" w:type="dxa"/>
+            <w:vAlign w:val="center"/>
+          </w:tcPr>
+          <w:p>
+            <w:pPr>
+              <w:jc w:val="center"/>
+              <w:rPr>
+                <w:sz w:val="18"/>
+                <w:szCs w:val="18"/>
+                <w:u w:val="none"/>
+              </w:rPr>
+            </w:pPr>
+            <w:r>
+              <w:rPr>
+                <w:sz w:val="18"/>
+                <w:szCs w:val="18"/>
+                <w:u w:val="none"/>
+              </w:rPr>
+              <w:t>Выполнено</w:t>
             </w:r>
           </w:p>
         </w:tc>
@@ -1306,11 +1497,11 @@
     <w:p>
       <w:pPr>
         <w:pBdr>
-          <w:top w:space="0" w:sz="0" w:val="nil"/>
-          <w:left w:space="0" w:sz="0" w:val="nil"/>
-          <w:bottom w:space="0" w:sz="0" w:val="nil"/>
-          <w:right w:space="0" w:sz="0" w:val="nil"/>
-          <w:between w:space="0" w:sz="0" w:val="nil"/>
+          <w:top w:val="none" w:color="auto" w:sz="0" w:space="0"/>
+          <w:left w:val="none" w:color="auto" w:sz="0" w:space="0"/>
+          <w:bottom w:val="none" w:color="auto" w:sz="0" w:space="0"/>
+          <w:right w:val="none" w:color="auto" w:sz="0" w:space="0"/>
+          <w:between w:val="none" w:color="auto" w:sz="0" w:space="0"/>
         </w:pBdr>
         <w:jc w:val="both"/>
         <w:rPr>
@@ -1322,39 +1513,33 @@
         <w:rPr>
           <w:color w:val="000000"/>
           <w:u w:val="none"/>
-          <w:rtl w:val="0"/>
-        </w:rPr>
-        <w:t xml:space="preserve">Содержание практики и планируемые результаты практики согласованы с руководителем практики от профильной организации</w:t>
+        </w:rPr>
+        <w:t>Содержание практики и планируемые результаты практики согласованы с руководителем практики от профильной организации</w:t>
       </w:r>
     </w:p>
     <w:p>
       <w:pPr>
         <w:pBdr>
-          <w:top w:space="0" w:sz="0" w:val="nil"/>
-          <w:left w:space="0" w:sz="0" w:val="nil"/>
-          <w:bottom w:space="0" w:sz="0" w:val="nil"/>
-          <w:right w:space="0" w:sz="0" w:val="nil"/>
-          <w:between w:space="0" w:sz="0" w:val="nil"/>
+          <w:top w:val="none" w:color="auto" w:sz="0" w:space="0"/>
+          <w:left w:val="none" w:color="auto" w:sz="0" w:space="0"/>
+          <w:bottom w:val="none" w:color="auto" w:sz="0" w:space="0"/>
+          <w:right w:val="none" w:color="auto" w:sz="0" w:space="0"/>
+          <w:between w:val="none" w:color="auto" w:sz="0" w:space="0"/>
         </w:pBdr>
         <w:rPr>
           <w:color w:val="000000"/>
           <w:u w:val="none"/>
         </w:rPr>
       </w:pPr>
-      <w:r>
-        <w:rPr>
-          <w:rtl w:val="0"/>
-        </w:rPr>
-      </w:r>
     </w:p>
     <w:p>
       <w:pPr>
         <w:pBdr>
-          <w:top w:space="0" w:sz="0" w:val="nil"/>
-          <w:left w:space="0" w:sz="0" w:val="nil"/>
-          <w:bottom w:space="0" w:sz="0" w:val="nil"/>
-          <w:right w:space="0" w:sz="0" w:val="nil"/>
-          <w:between w:space="0" w:sz="0" w:val="nil"/>
+          <w:top w:val="none" w:color="auto" w:sz="0" w:space="0"/>
+          <w:left w:val="none" w:color="auto" w:sz="0" w:space="0"/>
+          <w:bottom w:val="none" w:color="auto" w:sz="0" w:space="0"/>
+          <w:right w:val="none" w:color="auto" w:sz="0" w:space="0"/>
+          <w:between w:val="none" w:color="auto" w:sz="0" w:space="0"/>
         </w:pBdr>
         <w:rPr>
           <w:color w:val="000000"/>
@@ -1364,44 +1549,45 @@
         <w:rPr>
           <w:color w:val="000000"/>
           <w:u w:val="none"/>
-          <w:rtl w:val="0"/>
-        </w:rPr>
-        <w:t xml:space="preserve">Руководитель от УрФУ</w:t>
+        </w:rPr>
+        <w:t>Руководитель от УрФУ</w:t>
+      </w:r>
+      <w:r>
+        <w:rPr>
+          <w:color w:val="000000"/>
+          <w:u w:val="none"/>
+        </w:rPr>
         <w:tab/>
+      </w:r>
+      <w:r>
+        <w:rPr>
+          <w:color w:val="000000"/>
+          <w:u w:val="none"/>
+        </w:rPr>
         <w:tab/>
-        <w:tab/>
+      </w:r>
+      <w:r>
+        <w:rPr>
+          <w:color w:val="000000"/>
+          <w:u w:val="none"/>
+        </w:rPr>
         <w:t xml:space="preserve">__________                </w:t>
       </w:r>
       <w:r>
         <w:rPr>
           <w:color w:val="000000"/>
-          <w:rtl w:val="0"/>
-        </w:rPr>
-        <w:t xml:space="preserve">Корнякова Елена Михайловна   </w:t>
-      </w:r>
-      <w:r>
-        <w:rPr>
-          <w:color w:val="ffffff"/>
-          <w:rtl w:val="0"/>
-        </w:rPr>
-        <w:t xml:space="preserve">.</w:t>
-      </w:r>
-      <w:r>
-        <w:rPr>
-          <w:color w:val="000000"/>
-          <w:rtl w:val="0"/>
-        </w:rPr>
-        <w:t xml:space="preserve">                  </w:t>
+        </w:rPr>
+        <w:t xml:space="preserve">Корнякова Елена Михайловна                   </w:t>
       </w:r>
     </w:p>
     <w:p>
       <w:pPr>
         <w:pBdr>
-          <w:top w:space="0" w:sz="0" w:val="nil"/>
-          <w:left w:space="0" w:sz="0" w:val="nil"/>
-          <w:bottom w:space="0" w:sz="0" w:val="nil"/>
-          <w:right w:space="0" w:sz="0" w:val="nil"/>
-          <w:between w:space="0" w:sz="0" w:val="nil"/>
+          <w:top w:val="none" w:color="auto" w:sz="0" w:space="0"/>
+          <w:left w:val="none" w:color="auto" w:sz="0" w:space="0"/>
+          <w:bottom w:val="none" w:color="auto" w:sz="0" w:space="0"/>
+          <w:right w:val="none" w:color="auto" w:sz="0" w:space="0"/>
+          <w:between w:val="none" w:color="auto" w:sz="0" w:space="0"/>
         </w:pBdr>
         <w:rPr>
           <w:color w:val="000000"/>
@@ -1416,18 +1602,25 @@
           <w:szCs w:val="16"/>
           <w:u w:val="none"/>
           <w:vertAlign w:val="superscript"/>
-          <w:rtl w:val="0"/>
         </w:rPr>
         <w:t xml:space="preserve">                                                                                                                                    </w:t>
-        <w:tab/>
-      </w:r>
-      <w:r>
-        <w:rPr>
+      </w:r>
+      <w:r>
+        <w:rPr>
+          <w:color w:val="000000"/>
           <w:sz w:val="16"/>
           <w:szCs w:val="16"/>
           <w:u w:val="none"/>
           <w:vertAlign w:val="superscript"/>
-          <w:rtl w:val="0"/>
+        </w:rPr>
+        <w:tab/>
+      </w:r>
+      <w:r>
+        <w:rPr>
+          <w:sz w:val="16"/>
+          <w:szCs w:val="16"/>
+          <w:u w:val="none"/>
+          <w:vertAlign w:val="superscript"/>
         </w:rPr>
         <w:t xml:space="preserve">              </w:t>
       </w:r>
@@ -1436,19 +1629,18 @@
           <w:color w:val="000000"/>
           <w:u w:val="none"/>
           <w:vertAlign w:val="superscript"/>
-          <w:rtl w:val="0"/>
-        </w:rPr>
-        <w:t xml:space="preserve">Подпись                                                               расшифровка подписи</w:t>
+        </w:rPr>
+        <w:t>Подпись                                                               расшифровка подписи</w:t>
       </w:r>
     </w:p>
     <w:p>
       <w:pPr>
         <w:pBdr>
-          <w:top w:space="0" w:sz="0" w:val="nil"/>
-          <w:left w:space="0" w:sz="0" w:val="nil"/>
-          <w:bottom w:space="0" w:sz="0" w:val="nil"/>
-          <w:right w:space="0" w:sz="0" w:val="nil"/>
-          <w:between w:space="0" w:sz="0" w:val="nil"/>
+          <w:top w:val="none" w:color="auto" w:sz="0" w:space="0"/>
+          <w:left w:val="none" w:color="auto" w:sz="0" w:space="0"/>
+          <w:bottom w:val="none" w:color="auto" w:sz="0" w:space="0"/>
+          <w:right w:val="none" w:color="auto" w:sz="0" w:space="0"/>
+          <w:between w:val="none" w:color="auto" w:sz="0" w:space="0"/>
         </w:pBdr>
         <w:rPr>
           <w:color w:val="000000"/>
@@ -1459,41 +1651,37 @@
         <w:rPr>
           <w:color w:val="000000"/>
           <w:u w:val="none"/>
-          <w:rtl w:val="0"/>
         </w:rPr>
         <w:t xml:space="preserve">Руководитель от предприятия (организации)   __________                </w:t>
       </w:r>
       <w:r>
         <w:rPr>
           <w:color w:val="000000"/>
-          <w:rtl w:val="0"/>
-        </w:rPr>
-        <w:t xml:space="preserve">Езуб Антон Сергеевич</w:t>
-      </w:r>
-      <w:r>
-        <w:rPr>
-          <w:u w:val="none"/>
-          <w:rtl w:val="0"/>
-        </w:rPr>
-        <w:t xml:space="preserve">___</w:t>
+        </w:rPr>
+        <w:t>Езуб Антон Сергеевич</w:t>
+      </w:r>
+      <w:r>
+        <w:rPr>
+          <w:u w:val="none"/>
+        </w:rPr>
+        <w:t>___</w:t>
       </w:r>
       <w:r>
         <w:rPr>
           <w:color w:val="000000"/>
           <w:u w:val="none"/>
-          <w:rtl w:val="0"/>
-        </w:rPr>
-        <w:t xml:space="preserve">____</w:t>
+        </w:rPr>
+        <w:t>____</w:t>
       </w:r>
     </w:p>
     <w:p>
       <w:pPr>
         <w:pBdr>
-          <w:top w:space="0" w:sz="0" w:val="nil"/>
-          <w:left w:space="0" w:sz="0" w:val="nil"/>
-          <w:bottom w:space="0" w:sz="0" w:val="nil"/>
-          <w:right w:space="0" w:sz="0" w:val="nil"/>
-          <w:between w:space="0" w:sz="0" w:val="nil"/>
+          <w:top w:val="none" w:color="auto" w:sz="0" w:space="0"/>
+          <w:left w:val="none" w:color="auto" w:sz="0" w:space="0"/>
+          <w:bottom w:val="none" w:color="auto" w:sz="0" w:space="0"/>
+          <w:right w:val="none" w:color="auto" w:sz="0" w:space="0"/>
+          <w:between w:val="none" w:color="auto" w:sz="0" w:space="0"/>
         </w:pBdr>
         <w:rPr>
           <w:color w:val="000000"/>
@@ -1508,7 +1696,6 @@
           <w:szCs w:val="16"/>
           <w:u w:val="none"/>
           <w:vertAlign w:val="superscript"/>
-          <w:rtl w:val="0"/>
         </w:rPr>
         <w:t xml:space="preserve">                                                                                                                                                                                                </w:t>
       </w:r>
@@ -1517,15 +1704,14 @@
           <w:color w:val="000000"/>
           <w:u w:val="none"/>
           <w:vertAlign w:val="superscript"/>
-          <w:rtl w:val="0"/>
-        </w:rPr>
-        <w:t xml:space="preserve">Подпись                                                               расшифровка подписи</w:t>
+        </w:rPr>
+        <w:t>Подпись                                                               расшифровка подписи</w:t>
       </w:r>
     </w:p>
     <w:p>
       <w:pPr>
         <w:rPr>
-          <w:color w:val="ffffff"/>
+          <w:color w:val="FFFFFF"/>
           <w:u w:val="none"/>
         </w:rPr>
       </w:pPr>
@@ -1536,11 +1722,11 @@
     <w:p>
       <w:pPr>
         <w:pBdr>
-          <w:top w:space="0" w:sz="0" w:val="nil"/>
-          <w:left w:space="0" w:sz="0" w:val="nil"/>
-          <w:bottom w:space="0" w:sz="0" w:val="nil"/>
-          <w:right w:space="0" w:sz="0" w:val="nil"/>
-          <w:between w:space="0" w:sz="0" w:val="nil"/>
+          <w:top w:val="none" w:color="auto" w:sz="0" w:space="0"/>
+          <w:left w:val="none" w:color="auto" w:sz="0" w:space="0"/>
+          <w:bottom w:val="none" w:color="auto" w:sz="0" w:space="0"/>
+          <w:right w:val="none" w:color="auto" w:sz="0" w:space="0"/>
+          <w:between w:val="none" w:color="auto" w:sz="0" w:space="0"/>
         </w:pBdr>
         <w:rPr>
           <w:color w:val="000000"/>
@@ -1555,7 +1741,6 @@
           <w:szCs w:val="16"/>
           <w:u w:val="none"/>
           <w:vertAlign w:val="superscript"/>
-          <w:rtl w:val="0"/>
         </w:rPr>
         <w:t xml:space="preserve">                                                                                                                                                                     </w:t>
       </w:r>
@@ -1565,7 +1750,6 @@
           <w:szCs w:val="16"/>
           <w:u w:val="none"/>
           <w:vertAlign w:val="superscript"/>
-          <w:rtl w:val="0"/>
         </w:rPr>
         <w:t xml:space="preserve">                            </w:t>
       </w:r>
@@ -1574,204 +1758,414 @@
           <w:color w:val="000000"/>
           <w:u w:val="none"/>
           <w:vertAlign w:val="superscript"/>
-          <w:rtl w:val="0"/>
-        </w:rPr>
-        <w:t xml:space="preserve">Подпись                                                               расшифровка подписи</w:t>
+        </w:rPr>
+        <w:t>Подпись                                                               расшифровка подписи</w:t>
       </w:r>
     </w:p>
     <w:sectPr>
-      <w:pgSz w:h="16838" w:w="11906" w:orient="portrait"/>
-      <w:pgMar w:bottom="426" w:top="142" w:left="1701" w:right="850" w:header="708" w:footer="708"/>
+      <w:pgSz w:w="11906" w:h="16838"/>
+      <w:pgMar w:top="142" w:right="850" w:bottom="426" w:left="1701" w:header="708" w:footer="708" w:gutter="0"/>
       <w:pgNumType w:start="1"/>
+      <w:cols w:space="720" w:num="1"/>
     </w:sectPr>
   </w:body>
 </w:document>
 </file>
 
-<file path=word/numbering.xml><?xml version="1.0" encoding="utf-8"?>
-<w:numbering xmlns:mc="http://schemas.openxmlformats.org/markup-compatibility/2006" xmlns:o="urn:schemas-microsoft-com:office:office" xmlns:r="http://schemas.openxmlformats.org/officeDocument/2006/relationships" xmlns:m="http://schemas.openxmlformats.org/officeDocument/2006/math" xmlns:v="urn:schemas-microsoft-com:vml" xmlns:wp="http://schemas.openxmlformats.org/drawingml/2006/wordprocessingDrawing" xmlns:w10="urn:schemas-microsoft-com:office:word" xmlns:w="http://schemas.openxmlformats.org/wordprocessingml/2006/main" xmlns:wne="http://schemas.microsoft.com/office/word/2006/wordml" xmlns:sl="http://schemas.openxmlformats.org/schemaLibrary/2006/main" xmlns:a="http://schemas.openxmlformats.org/drawingml/2006/main" xmlns:pic="http://schemas.openxmlformats.org/drawingml/2006/picture" xmlns:c="http://schemas.openxmlformats.org/drawingml/2006/chart" xmlns:lc="http://schemas.openxmlformats.org/drawingml/2006/lockedCanvas" xmlns:dgm="http://schemas.openxmlformats.org/drawingml/2006/diagram" xmlns:wps="http://schemas.microsoft.com/office/word/2010/wordprocessingShape" xmlns:wpg="http://schemas.microsoft.com/office/word/2010/wordprocessingGroup" xmlns:w14="http://schemas.microsoft.com/office/word/2010/wordml" xmlns:w15="http://schemas.microsoft.com/office/word/2012/wordml" xmlns:w16="http://schemas.microsoft.com/office/word/2018/wordml" xmlns:w16cex="http://schemas.microsoft.com/office/word/2018/wordml/cex" xmlns:w16cid="http://schemas.microsoft.com/office/word/2016/wordml/cid" xmlns="http://schemas.microsoft.com/office/tasks/2019/documenttasks" xmlns:cr="http://schemas.microsoft.com/office/comments/2020/reactions"/>
-</file>
-
 <file path=word/styles.xml><?xml version="1.0" encoding="utf-8"?>
-<w:styles xmlns:mc="http://schemas.openxmlformats.org/markup-compatibility/2006" xmlns:o="urn:schemas-microsoft-com:office:office" xmlns:r="http://schemas.openxmlformats.org/officeDocument/2006/relationships" xmlns:m="http://schemas.openxmlformats.org/officeDocument/2006/math" xmlns:v="urn:schemas-microsoft-com:vml" xmlns:wp="http://schemas.openxmlformats.org/drawingml/2006/wordprocessingDrawing" xmlns:w10="urn:schemas-microsoft-com:office:word" xmlns:w="http://schemas.openxmlformats.org/wordprocessingml/2006/main" xmlns:wne="http://schemas.microsoft.com/office/word/2006/wordml" xmlns:sl="http://schemas.openxmlformats.org/schemaLibrary/2006/main" xmlns:a="http://schemas.openxmlformats.org/drawingml/2006/main" xmlns:pic="http://schemas.openxmlformats.org/drawingml/2006/picture" xmlns:c="http://schemas.openxmlformats.org/drawingml/2006/chart" xmlns:lc="http://schemas.openxmlformats.org/drawingml/2006/lockedCanvas" xmlns:dgm="http://schemas.openxmlformats.org/drawingml/2006/diagram" xmlns:wps="http://schemas.microsoft.com/office/word/2010/wordprocessingShape" xmlns:wpg="http://schemas.microsoft.com/office/word/2010/wordprocessingGroup" xmlns:w14="http://schemas.microsoft.com/office/word/2010/wordml" xmlns:w15="http://schemas.microsoft.com/office/word/2012/wordml" xmlns:w16="http://schemas.microsoft.com/office/word/2018/wordml" xmlns:w16cex="http://schemas.microsoft.com/office/word/2018/wordml/cex" xmlns:w16cid="http://schemas.microsoft.com/office/word/2016/wordml/cid" xmlns="http://schemas.microsoft.com/office/tasks/2019/documenttasks" xmlns:cr="http://schemas.microsoft.com/office/comments/2020/reactions">
+<w:styles xmlns:mc="http://schemas.openxmlformats.org/markup-compatibility/2006" xmlns:o="urn:schemas-microsoft-com:office:office" xmlns:r="http://schemas.openxmlformats.org/officeDocument/2006/relationships" xmlns:m="http://schemas.openxmlformats.org/officeDocument/2006/math" xmlns:v="urn:schemas-microsoft-com:vml" xmlns:w="http://schemas.openxmlformats.org/wordprocessingml/2006/main" xmlns:w14="http://schemas.microsoft.com/office/word/2010/wordml" xmlns:w10="urn:schemas-microsoft-com:office:word" xmlns:sl="http://schemas.openxmlformats.org/schemaLibrary/2006/main" xmlns:wpsCustomData="http://www.wps.cn/officeDocument/2013/wpsCustomData" mc:Ignorable="w14">
   <w:docDefaults>
     <w:rPrDefault>
       <w:rPr>
-        <w:sz w:val="22"/>
-        <w:szCs w:val="22"/>
-        <w:u w:val="single"/>
-        <w:lang w:val="ru"/>
+        <w:rFonts w:ascii="Times New Roman" w:hAnsi="Times New Roman" w:eastAsia="SimSun" w:cs="Times New Roman"/>
       </w:rPr>
     </w:rPrDefault>
-    <w:pPrDefault>
-      <w:pPr/>
-    </w:pPrDefault>
+    <w:pPrDefault/>
   </w:docDefaults>
-  <w:style w:type="table" w:styleId="TableNormal" w:default="1">
-    <w:name w:val="TableNormal"/>
-    <w:tblPr>
-      <w:tblCellMar>
-        <w:top w:w="100.0" w:type="dxa"/>
-        <w:left w:w="100.0" w:type="dxa"/>
-        <w:bottom w:w="100.0" w:type="dxa"/>
-        <w:right w:w="100.0" w:type="dxa"/>
-      </w:tblCellMar>
-    </w:tblPr>
+  <w:latentStyles w:count="260" w:defQFormat="0" w:defUnhideWhenUsed="1" w:defSemiHidden="1" w:defUIPriority="99" w:defLockedState="0">
+    <w:lsdException w:qFormat="1" w:unhideWhenUsed="0" w:uiPriority="0" w:semiHidden="0" w:name="Normal"/>
+    <w:lsdException w:qFormat="1" w:unhideWhenUsed="0" w:uiPriority="9" w:semiHidden="0" w:name="heading 1"/>
+    <w:lsdException w:qFormat="1" w:uiPriority="9" w:name="heading 2"/>
+    <w:lsdException w:qFormat="1" w:uiPriority="9" w:name="heading 3"/>
+    <w:lsdException w:qFormat="1" w:uiPriority="9" w:name="heading 4"/>
+    <w:lsdException w:qFormat="1" w:uiPriority="9" w:name="heading 5"/>
+    <w:lsdException w:qFormat="1" w:uiPriority="9" w:name="heading 6"/>
+    <w:lsdException w:qFormat="1" w:uiPriority="9" w:name="heading 7"/>
+    <w:lsdException w:qFormat="1" w:uiPriority="9" w:name="heading 8"/>
+    <w:lsdException w:qFormat="1" w:uiPriority="9" w:name="heading 9"/>
+    <w:lsdException w:uiPriority="99" w:name="index 1"/>
+    <w:lsdException w:uiPriority="99" w:name="index 2"/>
+    <w:lsdException w:uiPriority="99" w:name="index 3"/>
+    <w:lsdException w:uiPriority="99" w:name="index 4"/>
+    <w:lsdException w:uiPriority="99" w:name="index 5"/>
+    <w:lsdException w:uiPriority="99" w:name="index 6"/>
+    <w:lsdException w:uiPriority="99" w:name="index 7"/>
+    <w:lsdException w:uiPriority="99" w:name="index 8"/>
+    <w:lsdException w:uiPriority="99" w:name="index 9"/>
+    <w:lsdException w:uiPriority="39" w:name="toc 1"/>
+    <w:lsdException w:uiPriority="39" w:name="toc 2"/>
+    <w:lsdException w:uiPriority="39" w:name="toc 3"/>
+    <w:lsdException w:uiPriority="39" w:name="toc 4"/>
+    <w:lsdException w:uiPriority="39" w:name="toc 5"/>
+    <w:lsdException w:uiPriority="39" w:name="toc 6"/>
+    <w:lsdException w:uiPriority="39" w:name="toc 7"/>
+    <w:lsdException w:uiPriority="39" w:name="toc 8"/>
+    <w:lsdException w:uiPriority="39" w:name="toc 9"/>
+    <w:lsdException w:uiPriority="99" w:name="Normal Indent"/>
+    <w:lsdException w:uiPriority="99" w:name="footnote text"/>
+    <w:lsdException w:uiPriority="99" w:name="annotation text"/>
+    <w:lsdException w:uiPriority="99" w:name="header"/>
+    <w:lsdException w:uiPriority="99" w:name="footer"/>
+    <w:lsdException w:uiPriority="99" w:name="index heading"/>
+    <w:lsdException w:qFormat="1" w:uiPriority="35" w:name="caption"/>
+    <w:lsdException w:uiPriority="99" w:name="table of figures"/>
+    <w:lsdException w:uiPriority="99" w:name="envelope address"/>
+    <w:lsdException w:uiPriority="99" w:name="envelope return"/>
+    <w:lsdException w:uiPriority="99" w:name="footnote reference"/>
+    <w:lsdException w:uiPriority="99" w:name="annotation reference"/>
+    <w:lsdException w:uiPriority="99" w:name="line number"/>
+    <w:lsdException w:uiPriority="99" w:name="page number"/>
+    <w:lsdException w:uiPriority="99" w:name="endnote reference"/>
+    <w:lsdException w:uiPriority="99" w:name="endnote text"/>
+    <w:lsdException w:uiPriority="99" w:name="table of authorities"/>
+    <w:lsdException w:uiPriority="99" w:name="macro"/>
+    <w:lsdException w:uiPriority="99" w:name="toa heading"/>
+    <w:lsdException w:uiPriority="99" w:name="List"/>
+    <w:lsdException w:uiPriority="99" w:name="List Bullet"/>
+    <w:lsdException w:uiPriority="99" w:name="List Number"/>
+    <w:lsdException w:uiPriority="99" w:name="List 2"/>
+    <w:lsdException w:uiPriority="99" w:name="List 3"/>
+    <w:lsdException w:uiPriority="99" w:name="List 4"/>
+    <w:lsdException w:uiPriority="99" w:name="List 5"/>
+    <w:lsdException w:uiPriority="99" w:name="List Bullet 2"/>
+    <w:lsdException w:uiPriority="99" w:name="List Bullet 3"/>
+    <w:lsdException w:uiPriority="99" w:name="List Bullet 4"/>
+    <w:lsdException w:uiPriority="99" w:name="List Bullet 5"/>
+    <w:lsdException w:uiPriority="99" w:name="List Number 2"/>
+    <w:lsdException w:uiPriority="99" w:name="List Number 3"/>
+    <w:lsdException w:uiPriority="99" w:name="List Number 4"/>
+    <w:lsdException w:uiPriority="99" w:name="List Number 5"/>
+    <w:lsdException w:qFormat="1" w:unhideWhenUsed="0" w:uiPriority="10" w:semiHidden="0" w:name="Title"/>
+    <w:lsdException w:uiPriority="99" w:name="Closing"/>
+    <w:lsdException w:uiPriority="99" w:name="Signature"/>
+    <w:lsdException w:qFormat="1" w:uiPriority="1" w:name="Default Paragraph Font"/>
+    <w:lsdException w:uiPriority="99" w:name="Body Text"/>
+    <w:lsdException w:uiPriority="99" w:name="Body Text Indent"/>
+    <w:lsdException w:uiPriority="99" w:name="List Continue"/>
+    <w:lsdException w:uiPriority="99" w:name="List Continue 2"/>
+    <w:lsdException w:uiPriority="99" w:name="List Continue 3"/>
+    <w:lsdException w:uiPriority="99" w:name="List Continue 4"/>
+    <w:lsdException w:uiPriority="99" w:name="List Continue 5"/>
+    <w:lsdException w:uiPriority="99" w:name="Message Header"/>
+    <w:lsdException w:qFormat="1" w:unhideWhenUsed="0" w:uiPriority="11" w:semiHidden="0" w:name="Subtitle"/>
+    <w:lsdException w:uiPriority="99" w:name="Salutation"/>
+    <w:lsdException w:uiPriority="99" w:name="Date"/>
+    <w:lsdException w:uiPriority="99" w:name="Body Text First Indent"/>
+    <w:lsdException w:uiPriority="99" w:name="Body Text First Indent 2"/>
+    <w:lsdException w:uiPriority="99" w:name="Note Heading"/>
+    <w:lsdException w:uiPriority="99" w:name="Body Text 2"/>
+    <w:lsdException w:uiPriority="99" w:name="Body Text 3"/>
+    <w:lsdException w:uiPriority="99" w:name="Body Text Indent 2"/>
+    <w:lsdException w:uiPriority="99" w:name="Body Text Indent 3"/>
+    <w:lsdException w:uiPriority="99" w:name="Block Text"/>
+    <w:lsdException w:uiPriority="99" w:name="Hyperlink"/>
+    <w:lsdException w:uiPriority="99" w:name="FollowedHyperlink"/>
+    <w:lsdException w:qFormat="1" w:unhideWhenUsed="0" w:uiPriority="22" w:semiHidden="0" w:name="Strong"/>
+    <w:lsdException w:qFormat="1" w:unhideWhenUsed="0" w:uiPriority="20" w:semiHidden="0" w:name="Emphasis"/>
+    <w:lsdException w:uiPriority="99" w:name="Document Map"/>
+    <w:lsdException w:uiPriority="99" w:name="Plain Text"/>
+    <w:lsdException w:uiPriority="99" w:name="E-mail Signature"/>
+    <w:lsdException w:uiPriority="99" w:name="Normal (Web)"/>
+    <w:lsdException w:uiPriority="99" w:name="HTML Acronym"/>
+    <w:lsdException w:uiPriority="99" w:name="HTML Address"/>
+    <w:lsdException w:uiPriority="99" w:name="HTML Cite"/>
+    <w:lsdException w:uiPriority="99" w:name="HTML Code"/>
+    <w:lsdException w:uiPriority="99" w:name="HTML Definition"/>
+    <w:lsdException w:uiPriority="99" w:name="HTML Keyboard"/>
+    <w:lsdException w:uiPriority="99" w:name="HTML Preformatted"/>
+    <w:lsdException w:uiPriority="99" w:name="HTML Sample"/>
+    <w:lsdException w:uiPriority="99" w:name="HTML Typewriter"/>
+    <w:lsdException w:uiPriority="99" w:name="HTML Variable"/>
+    <w:lsdException w:qFormat="1" w:uiPriority="99" w:name="Normal Table"/>
+    <w:lsdException w:uiPriority="99" w:name="annotation subject"/>
+    <w:lsdException w:uiPriority="99" w:name="Table Simple 1"/>
+    <w:lsdException w:uiPriority="99" w:name="Table Simple 2"/>
+    <w:lsdException w:uiPriority="99" w:name="Table Simple 3"/>
+    <w:lsdException w:uiPriority="99" w:name="Table Classic 1"/>
+    <w:lsdException w:uiPriority="99" w:name="Table Classic 2"/>
+    <w:lsdException w:uiPriority="99" w:name="Table Classic 3"/>
+    <w:lsdException w:uiPriority="99" w:name="Table Classic 4"/>
+    <w:lsdException w:uiPriority="99" w:name="Table Colorful 1"/>
+    <w:lsdException w:uiPriority="99" w:name="Table Colorful 2"/>
+    <w:lsdException w:uiPriority="99" w:name="Table Colorful 3"/>
+    <w:lsdException w:uiPriority="99" w:name="Table Columns 1"/>
+    <w:lsdException w:uiPriority="99" w:name="Table Columns 2"/>
+    <w:lsdException w:uiPriority="99" w:name="Table Columns 3"/>
+    <w:lsdException w:uiPriority="99" w:name="Table Columns 4"/>
+    <w:lsdException w:uiPriority="99" w:name="Table Columns 5"/>
+    <w:lsdException w:uiPriority="99" w:name="Table Grid 1"/>
+    <w:lsdException w:uiPriority="99" w:name="Table Grid 2"/>
+    <w:lsdException w:uiPriority="99" w:name="Table Grid 3"/>
+    <w:lsdException w:uiPriority="99" w:name="Table Grid 4"/>
+    <w:lsdException w:uiPriority="99" w:name="Table Grid 5"/>
+    <w:lsdException w:uiPriority="99" w:name="Table Grid 6"/>
+    <w:lsdException w:uiPriority="99" w:name="Table Grid 7"/>
+    <w:lsdException w:uiPriority="99" w:name="Table Grid 8"/>
+    <w:lsdException w:uiPriority="99" w:name="Table List 1"/>
+    <w:lsdException w:uiPriority="99" w:name="Table List 2"/>
+    <w:lsdException w:uiPriority="99" w:name="Table List 3"/>
+    <w:lsdException w:uiPriority="99" w:name="Table List 4"/>
+    <w:lsdException w:uiPriority="99" w:name="Table List 5"/>
+    <w:lsdException w:uiPriority="99" w:name="Table List 6"/>
+    <w:lsdException w:uiPriority="99" w:name="Table List 7"/>
+    <w:lsdException w:uiPriority="99" w:name="Table List 8"/>
+    <w:lsdException w:uiPriority="99" w:name="Table 3D effects 1"/>
+    <w:lsdException w:uiPriority="99" w:name="Table 3D effects 2"/>
+    <w:lsdException w:uiPriority="99" w:name="Table 3D effects 3"/>
+    <w:lsdException w:uiPriority="99" w:name="Table Contemporary"/>
+    <w:lsdException w:uiPriority="99" w:name="Table Elegant"/>
+    <w:lsdException w:uiPriority="99" w:name="Table Professional"/>
+    <w:lsdException w:uiPriority="99" w:name="Table Subtle 1"/>
+    <w:lsdException w:uiPriority="99" w:name="Table Subtle 2"/>
+    <w:lsdException w:uiPriority="99" w:name="Table Web 1"/>
+    <w:lsdException w:uiPriority="99" w:name="Table Web 2"/>
+    <w:lsdException w:uiPriority="99" w:name="Table Web 3"/>
+    <w:lsdException w:uiPriority="99" w:name="Balloon Text"/>
+    <w:lsdException w:unhideWhenUsed="0" w:uiPriority="39" w:semiHidden="0" w:name="Table Grid"/>
+    <w:lsdException w:uiPriority="99" w:name="Table Theme"/>
+  </w:latentStyles>
+  <w:style w:type="paragraph" w:default="1" w:styleId="1">
+    <w:name w:val="Normal"/>
+    <w:qFormat/>
+    <w:uiPriority w:val="0"/>
+    <w:rPr>
+      <w:rFonts w:ascii="Times New Roman" w:hAnsi="Times New Roman" w:eastAsia="Times New Roman" w:cs="Times New Roman"/>
+      <w:sz w:val="22"/>
+      <w:szCs w:val="22"/>
+      <w:u w:val="single"/>
+      <w:lang w:val="ru" w:eastAsia="ru-RU" w:bidi="ar-SA"/>
+    </w:rPr>
   </w:style>
-  <w:style w:type="paragraph" w:styleId="Normal" w:default="1">
-    <w:name w:val="normal"/>
-  </w:style>
-  <w:style w:type="paragraph" w:styleId="Heading1">
+  <w:style w:type="paragraph" w:styleId="2">
     <w:name w:val="heading 1"/>
-    <w:basedOn w:val="Normal"/>
-    <w:next w:val="Normal"/>
+    <w:basedOn w:val="1"/>
+    <w:next w:val="1"/>
+    <w:qFormat/>
+    <w:uiPriority w:val="9"/>
     <w:pPr>
-      <w:keepNext w:val="1"/>
-      <w:keepLines w:val="1"/>
-      <w:spacing w:after="120" w:before="480" w:lineRule="auto"/>
+      <w:keepNext/>
+      <w:keepLines/>
+      <w:spacing w:before="480" w:after="120"/>
+      <w:outlineLvl w:val="0"/>
     </w:pPr>
     <w:rPr>
-      <w:b w:val="1"/>
-      <w:bCs w:val="1"/>
+      <w:b/>
+      <w:bCs/>
       <w:sz w:val="48"/>
       <w:szCs w:val="48"/>
     </w:rPr>
   </w:style>
-  <w:style w:type="paragraph" w:styleId="Heading2">
+  <w:style w:type="paragraph" w:styleId="3">
     <w:name w:val="heading 2"/>
-    <w:basedOn w:val="Normal"/>
-    <w:next w:val="Normal"/>
+    <w:basedOn w:val="1"/>
+    <w:next w:val="1"/>
+    <w:semiHidden/>
+    <w:unhideWhenUsed/>
+    <w:qFormat/>
+    <w:uiPriority w:val="9"/>
     <w:pPr>
-      <w:keepNext w:val="1"/>
-      <w:keepLines w:val="1"/>
-      <w:spacing w:after="80" w:before="360" w:lineRule="auto"/>
+      <w:keepNext/>
+      <w:keepLines/>
+      <w:spacing w:before="360" w:after="80"/>
+      <w:outlineLvl w:val="1"/>
     </w:pPr>
     <w:rPr>
-      <w:b w:val="1"/>
-      <w:bCs w:val="1"/>
+      <w:b/>
+      <w:bCs/>
       <w:sz w:val="36"/>
       <w:szCs w:val="36"/>
     </w:rPr>
   </w:style>
-  <w:style w:type="paragraph" w:styleId="Heading3">
+  <w:style w:type="paragraph" w:styleId="4">
     <w:name w:val="heading 3"/>
-    <w:basedOn w:val="Normal"/>
-    <w:next w:val="Normal"/>
+    <w:basedOn w:val="1"/>
+    <w:next w:val="1"/>
+    <w:semiHidden/>
+    <w:unhideWhenUsed/>
+    <w:qFormat/>
+    <w:uiPriority w:val="9"/>
     <w:pPr>
-      <w:keepNext w:val="1"/>
-      <w:keepLines w:val="1"/>
-      <w:spacing w:after="80" w:before="280" w:lineRule="auto"/>
+      <w:keepNext/>
+      <w:keepLines/>
+      <w:spacing w:before="280" w:after="80"/>
+      <w:outlineLvl w:val="2"/>
     </w:pPr>
     <w:rPr>
-      <w:b w:val="1"/>
-      <w:bCs w:val="1"/>
+      <w:b/>
+      <w:bCs/>
       <w:sz w:val="28"/>
       <w:szCs w:val="28"/>
     </w:rPr>
   </w:style>
-  <w:style w:type="paragraph" w:styleId="Heading4">
+  <w:style w:type="paragraph" w:styleId="5">
     <w:name w:val="heading 4"/>
-    <w:basedOn w:val="Normal"/>
-    <w:next w:val="Normal"/>
+    <w:basedOn w:val="1"/>
+    <w:next w:val="1"/>
+    <w:semiHidden/>
+    <w:unhideWhenUsed/>
+    <w:qFormat/>
+    <w:uiPriority w:val="9"/>
     <w:pPr>
-      <w:keepNext w:val="1"/>
-      <w:keepLines w:val="1"/>
-      <w:spacing w:after="40" w:before="240" w:lineRule="auto"/>
+      <w:keepNext/>
+      <w:keepLines/>
+      <w:spacing w:before="240" w:after="40"/>
+      <w:outlineLvl w:val="3"/>
     </w:pPr>
     <w:rPr>
-      <w:b w:val="1"/>
-      <w:bCs w:val="1"/>
+      <w:b/>
+      <w:bCs/>
       <w:sz w:val="24"/>
       <w:szCs w:val="24"/>
     </w:rPr>
   </w:style>
-  <w:style w:type="paragraph" w:styleId="Heading5">
+  <w:style w:type="paragraph" w:styleId="6">
     <w:name w:val="heading 5"/>
-    <w:basedOn w:val="Normal"/>
-    <w:next w:val="Normal"/>
+    <w:basedOn w:val="1"/>
+    <w:next w:val="1"/>
+    <w:semiHidden/>
+    <w:unhideWhenUsed/>
+    <w:qFormat/>
+    <w:uiPriority w:val="9"/>
     <w:pPr>
-      <w:keepNext w:val="1"/>
-      <w:keepLines w:val="1"/>
-      <w:spacing w:after="40" w:before="220" w:lineRule="auto"/>
+      <w:keepNext/>
+      <w:keepLines/>
+      <w:spacing w:before="220" w:after="40"/>
+      <w:outlineLvl w:val="4"/>
     </w:pPr>
     <w:rPr>
-      <w:b w:val="1"/>
-      <w:bCs w:val="1"/>
+      <w:b/>
+      <w:bCs/>
     </w:rPr>
   </w:style>
-  <w:style w:type="paragraph" w:styleId="Heading6">
+  <w:style w:type="paragraph" w:styleId="7">
     <w:name w:val="heading 6"/>
-    <w:basedOn w:val="Normal"/>
-    <w:next w:val="Normal"/>
+    <w:basedOn w:val="1"/>
+    <w:next w:val="1"/>
+    <w:semiHidden/>
+    <w:unhideWhenUsed/>
+    <w:qFormat/>
+    <w:uiPriority w:val="9"/>
     <w:pPr>
-      <w:keepNext w:val="1"/>
-      <w:keepLines w:val="1"/>
-      <w:spacing w:after="40" w:before="200" w:lineRule="auto"/>
+      <w:keepNext/>
+      <w:keepLines/>
+      <w:spacing w:before="200" w:after="40"/>
+      <w:outlineLvl w:val="5"/>
     </w:pPr>
     <w:rPr>
-      <w:b w:val="1"/>
-      <w:bCs w:val="1"/>
+      <w:b/>
+      <w:bCs/>
       <w:sz w:val="20"/>
       <w:szCs w:val="20"/>
     </w:rPr>
   </w:style>
-  <w:style w:type="paragraph" w:styleId="Title">
+  <w:style w:type="character" w:default="1" w:styleId="8">
+    <w:name w:val="Default Paragraph Font"/>
+    <w:semiHidden/>
+    <w:unhideWhenUsed/>
+    <w:qFormat/>
+    <w:uiPriority w:val="1"/>
+  </w:style>
+  <w:style w:type="table" w:default="1" w:styleId="9">
+    <w:name w:val="Normal Table"/>
+    <w:semiHidden/>
+    <w:unhideWhenUsed/>
+    <w:qFormat/>
+    <w:uiPriority w:val="99"/>
+    <w:tblPr>
+      <w:tblCellMar>
+        <w:top w:w="0" w:type="dxa"/>
+        <w:left w:w="108" w:type="dxa"/>
+        <w:bottom w:w="0" w:type="dxa"/>
+        <w:right w:w="108" w:type="dxa"/>
+      </w:tblCellMar>
+    </w:tblPr>
+  </w:style>
+  <w:style w:type="paragraph" w:styleId="10">
     <w:name w:val="Title"/>
-    <w:basedOn w:val="Normal"/>
-    <w:next w:val="Normal"/>
+    <w:basedOn w:val="1"/>
+    <w:next w:val="1"/>
+    <w:qFormat/>
+    <w:uiPriority w:val="10"/>
     <w:pPr>
-      <w:keepNext w:val="1"/>
-      <w:keepLines w:val="1"/>
-      <w:spacing w:after="120" w:before="480" w:lineRule="auto"/>
+      <w:keepNext/>
+      <w:keepLines/>
+      <w:spacing w:before="480" w:after="120"/>
     </w:pPr>
     <w:rPr>
-      <w:b w:val="1"/>
-      <w:bCs w:val="1"/>
+      <w:b/>
+      <w:bCs/>
       <w:sz w:val="72"/>
       <w:szCs w:val="72"/>
     </w:rPr>
   </w:style>
-  <w:style w:type="paragraph" w:styleId="Subtitle">
+  <w:style w:type="paragraph" w:styleId="11">
     <w:name w:val="Subtitle"/>
-    <w:basedOn w:val="Normal"/>
-    <w:next w:val="Normal"/>
+    <w:basedOn w:val="1"/>
+    <w:next w:val="1"/>
+    <w:qFormat/>
+    <w:uiPriority w:val="11"/>
     <w:pPr>
-      <w:keepNext w:val="1"/>
-      <w:keepLines w:val="1"/>
-      <w:spacing w:after="80" w:before="360" w:lineRule="auto"/>
+      <w:keepNext/>
+      <w:keepLines/>
+      <w:spacing w:before="360" w:after="80"/>
     </w:pPr>
     <w:rPr>
-      <w:rFonts w:ascii="Georgia" w:cs="Georgia" w:eastAsia="Georgia" w:hAnsi="Georgia"/>
-      <w:i w:val="1"/>
-      <w:iCs w:val="1"/>
+      <w:rFonts w:ascii="Georgia" w:hAnsi="Georgia" w:eastAsia="Georgia" w:cs="Georgia"/>
+      <w:i/>
+      <w:iCs/>
       <w:color w:val="666666"/>
       <w:sz w:val="48"/>
       <w:szCs w:val="48"/>
     </w:rPr>
   </w:style>
-  <w:style w:type="table" w:styleId="Table1">
-    <w:basedOn w:val="TableNormal"/>
+  <w:style w:type="table" w:customStyle="1" w:styleId="12">
+    <w:name w:val="TableNormal"/>
+    <w:qFormat/>
+    <w:uiPriority w:val="0"/>
     <w:tblPr>
-      <w:tblStyleRowBandSize w:val="1"/>
-      <w:tblStyleColBandSize w:val="1"/>
       <w:tblCellMar>
-        <w:top w:w="0.0" w:type="dxa"/>
-        <w:left w:w="108.0" w:type="dxa"/>
-        <w:bottom w:w="0.0" w:type="dxa"/>
-        <w:right w:w="108.0" w:type="dxa"/>
+        <w:top w:w="100" w:type="dxa"/>
+        <w:left w:w="100" w:type="dxa"/>
+        <w:bottom w:w="100" w:type="dxa"/>
+        <w:right w:w="100" w:type="dxa"/>
       </w:tblCellMar>
     </w:tblPr>
   </w:style>
-  <w:style w:type="table" w:styleId="Table2">
-    <w:basedOn w:val="TableNormal"/>
+  <w:style w:type="table" w:customStyle="1" w:styleId="13">
+    <w:name w:val="_Style 12"/>
+    <w:basedOn w:val="12"/>
+    <w:qFormat/>
+    <w:uiPriority w:val="0"/>
     <w:tblPr>
-      <w:tblStyleRowBandSize w:val="1"/>
-      <w:tblStyleColBandSize w:val="1"/>
       <w:tblCellMar>
-        <w:top w:w="0.0" w:type="dxa"/>
-        <w:left w:w="115.0" w:type="dxa"/>
-        <w:bottom w:w="0.0" w:type="dxa"/>
-        <w:right w:w="115.0" w:type="dxa"/>
+        <w:top w:w="0" w:type="dxa"/>
+        <w:left w:w="108" w:type="dxa"/>
+        <w:bottom w:w="0" w:type="dxa"/>
+        <w:right w:w="108" w:type="dxa"/>
+      </w:tblCellMar>
+    </w:tblPr>
+  </w:style>
+  <w:style w:type="table" w:customStyle="1" w:styleId="14">
+    <w:name w:val="_Style 13"/>
+    <w:basedOn w:val="12"/>
+    <w:qFormat/>
+    <w:uiPriority w:val="0"/>
+    <w:tblPr>
+      <w:tblCellMar>
+        <w:top w:w="0" w:type="dxa"/>
+        <w:left w:w="115" w:type="dxa"/>
+        <w:bottom w:w="0" w:type="dxa"/>
+        <w:right w:w="115" w:type="dxa"/>
       </w:tblCellMar>
     </w:tblPr>
   </w:style>
@@ -2094,21 +2488,17 @@
       </a:style>
     </a:lnDef>
   </a:objectDefaults>
-  <a:extraClrSchemeLst/>
 </a:theme>
 </file>
 
-<file path=customXML/item1.xml><?xml version="1.0" encoding="utf-8"?>
+<file path=customXml/item1.xml><?xml version="1.0" encoding="utf-8"?>
 <go:gDocsCustomXmlDataStorage xmlns:go="http://customooxmlschemas.google.com/" xmlns:r="http://schemas.openxmlformats.org/officeDocument/2006/relationships" uri="GoogleDocsCustomDataVersion2">
   <go:docsCustomData xmlns:go="http://customooxmlschemas.google.com/" roundtripDataSignature="AMtx7mjj7655irf2W/6+Qwrlq8bMdDXgyw==">CgMxLjAyDWguM2k5c3h4NzdqZzQyDmguajZ2MTJsd2E1eTgwOAByITFiSXdJcHFWT2ZpZTEyNUt2eUw4M24zdmZjWk84cTdDYg==</go:docsCustomData>
 </go:gDocsCustomXmlDataStorage>
 </file>
 
-<file path=customXML/itemProps1.xml><?xml version="1.0" encoding="utf-8"?>
+<file path=customXml/itemProps1.xml><?xml version="1.0" encoding="utf-8"?>
 <ds:datastoreItem xmlns:ds="http://schemas.openxmlformats.org/officeDocument/2006/customXml" ds:itemID="{11111111-1234-1234-1234-123412341234}">
-  <ds:schemaRefs>
-    <ds:schemaRef ds:uri="http://schemas.openxmlformats.org/officeDocument/2006/relationships"/>
-    <ds:schemaRef ds:uri="http://customooxmlschemas.google.com/"/>
-  </ds:schemaRefs>
+  <ds:schemaRefs/>
 </ds:datastoreItem>
 </file>
</xml_diff>